<commit_message>
Add thesis draft latex
</commit_message>
<xml_diff>
--- a/Documentation/Draft/Study and Evaluation of Sharding in Distributed Databases.docx
+++ b/Documentation/Draft/Study and Evaluation of Sharding in Distributed Databases.docx
@@ -1,6 +1,6 @@
 
 <file path=word/document.xml><?xml version="1.0" encoding="utf-8"?>
-<w:document xmlns:wpc="http://schemas.microsoft.com/office/word/2010/wordprocessingCanvas" xmlns:cx="http://schemas.microsoft.com/office/drawing/2014/chartex" xmlns:cx1="http://schemas.microsoft.com/office/drawing/2015/9/8/chartex" xmlns:cx2="http://schemas.microsoft.com/office/drawing/2015/10/21/chartex" xmlns:cx3="http://schemas.microsoft.com/office/drawing/2016/5/9/chartex" xmlns:cx4="http://schemas.microsoft.com/office/drawing/2016/5/10/chartex" xmlns:cx5="http://schemas.microsoft.com/office/drawing/2016/5/11/chartex" xmlns:cx6="http://schemas.microsoft.com/office/drawing/2016/5/12/chartex" xmlns:cx7="http://schemas.microsoft.com/office/drawing/2016/5/13/chartex" xmlns:cx8="http://schemas.microsoft.com/office/drawing/2016/5/14/chartex" xmlns:mc="http://schemas.openxmlformats.org/markup-compatibility/2006" xmlns:aink="http://schemas.microsoft.com/office/drawing/2016/ink" xmlns:am3d="http://schemas.microsoft.com/office/drawing/2017/model3d" xmlns:o="urn:schemas-microsoft-com:office:office" xmlns:oel="http://schemas.microsoft.com/office/2019/extlst" xmlns:r="http://schemas.openxmlformats.org/officeDocument/2006/relationships" xmlns:m="http://schemas.openxmlformats.org/officeDocument/2006/math" xmlns:v="urn:schemas-microsoft-com:vml" xmlns:wp14="http://schemas.microsoft.com/office/word/2010/wordprocessingDrawing" xmlns:wp="http://schemas.openxmlformats.org/drawingml/2006/wordprocessingDrawing" xmlns:w10="urn:schemas-microsoft-com:office:word" xmlns:w="http://schemas.openxmlformats.org/wordprocessingml/2006/main" xmlns:w14="http://schemas.microsoft.com/office/word/2010/wordml" xmlns:w15="http://schemas.microsoft.com/office/word/2012/wordml" xmlns:w16cex="http://schemas.microsoft.com/office/word/2018/wordml/cex" xmlns:w16cid="http://schemas.microsoft.com/office/word/2016/wordml/cid" xmlns:w16="http://schemas.microsoft.com/office/word/2018/wordml" xmlns:w16sdtdh="http://schemas.microsoft.com/office/word/2020/wordml/sdtdatahash" xmlns:w16se="http://schemas.microsoft.com/office/word/2015/wordml/symex" xmlns:wpg="http://schemas.microsoft.com/office/word/2010/wordprocessingGroup" xmlns:wpi="http://schemas.microsoft.com/office/word/2010/wordprocessingInk" xmlns:wne="http://schemas.microsoft.com/office/word/2006/wordml" xmlns:wps="http://schemas.microsoft.com/office/word/2010/wordprocessingShape" mc:Ignorable="w14 w15 w16se w16cid w16 w16cex w16sdtdh wp14">
+<w:document xmlns:wpc="http://schemas.microsoft.com/office/word/2010/wordprocessingCanvas" xmlns:cx="http://schemas.microsoft.com/office/drawing/2014/chartex" xmlns:cx1="http://schemas.microsoft.com/office/drawing/2015/9/8/chartex" xmlns:cx2="http://schemas.microsoft.com/office/drawing/2015/10/21/chartex" xmlns:cx3="http://schemas.microsoft.com/office/drawing/2016/5/9/chartex" xmlns:cx4="http://schemas.microsoft.com/office/drawing/2016/5/10/chartex" xmlns:cx5="http://schemas.microsoft.com/office/drawing/2016/5/11/chartex" xmlns:cx6="http://schemas.microsoft.com/office/drawing/2016/5/12/chartex" xmlns:cx7="http://schemas.microsoft.com/office/drawing/2016/5/13/chartex" xmlns:cx8="http://schemas.microsoft.com/office/drawing/2016/5/14/chartex" xmlns:mc="http://schemas.openxmlformats.org/markup-compatibility/2006" xmlns:aink="http://schemas.microsoft.com/office/drawing/2016/ink" xmlns:am3d="http://schemas.microsoft.com/office/drawing/2017/model3d" xmlns:o="urn:schemas-microsoft-com:office:office" xmlns:oel="http://schemas.microsoft.com/office/2019/extlst" xmlns:r="http://schemas.openxmlformats.org/officeDocument/2006/relationships" xmlns:m="http://schemas.openxmlformats.org/officeDocument/2006/math" xmlns:v="urn:schemas-microsoft-com:vml" xmlns:wp14="http://schemas.microsoft.com/office/word/2010/wordprocessingDrawing" xmlns:wp="http://schemas.openxmlformats.org/drawingml/2006/wordprocessingDrawing" xmlns:w10="urn:schemas-microsoft-com:office:word" xmlns:w="http://schemas.openxmlformats.org/wordprocessingml/2006/main" xmlns:w14="http://schemas.microsoft.com/office/word/2010/wordml" xmlns:w15="http://schemas.microsoft.com/office/word/2012/wordml" xmlns:w16cex="http://schemas.microsoft.com/office/word/2018/wordml/cex" xmlns:w16cid="http://schemas.microsoft.com/office/word/2016/wordml/cid" xmlns:w16="http://schemas.microsoft.com/office/word/2018/wordml" xmlns:w16du="http://schemas.microsoft.com/office/word/2023/wordml/word16du" xmlns:w16sdtdh="http://schemas.microsoft.com/office/word/2020/wordml/sdtdatahash" xmlns:w16se="http://schemas.microsoft.com/office/word/2015/wordml/symex" xmlns:wpg="http://schemas.microsoft.com/office/word/2010/wordprocessingGroup" xmlns:wpi="http://schemas.microsoft.com/office/word/2010/wordprocessingInk" xmlns:wne="http://schemas.microsoft.com/office/word/2006/wordml" xmlns:wps="http://schemas.microsoft.com/office/word/2010/wordprocessingShape" mc:Ignorable="w14 w15 w16se w16cid w16 w16cex w16sdtdh wp14">
   <w:body>
     <w:p>
       <w:pPr>
@@ -940,7 +940,25 @@
           <w:sz w:val="22"/>
           <w:szCs w:val="22"/>
         </w:rPr>
-        <w:t xml:space="preserve">The limitations of traditional databases in handling large-scale data are addressed through sharding, which distributes data across multiple nodes, allowing for better performance, increased scalability, and improved fault tolerance. The main research question is to evaluate the performance of consistent hash sharding in Redis key-value stores and assess its effectiveness in handling large-scale data. A middleware is implemented to enable a system of distributed databases, and </w:t>
+        <w:t xml:space="preserve">The limitations of traditional databases in handling large-scale data are addressed through sharding, which distributes data across multiple nodes, allowing for better performance, increased scalability, and improved fault tolerance. The main research question is to evaluate the performance of consistent hash sharding in Redis key-value stores and assess its effectiveness in handling large-scale data. </w:t>
+      </w:r>
+      <w:proofErr w:type="gramStart"/>
+      <w:r>
+        <w:rPr>
+          <w:rFonts w:asciiTheme="minorHAnsi" w:hAnsiTheme="minorHAnsi" w:cstheme="minorHAnsi"/>
+          <w:sz w:val="22"/>
+          <w:szCs w:val="22"/>
+        </w:rPr>
+        <w:t>A middleware</w:t>
+      </w:r>
+      <w:proofErr w:type="gramEnd"/>
+      <w:r>
+        <w:rPr>
+          <w:rFonts w:asciiTheme="minorHAnsi" w:hAnsiTheme="minorHAnsi" w:cstheme="minorHAnsi"/>
+          <w:sz w:val="22"/>
+          <w:szCs w:val="22"/>
+        </w:rPr>
+        <w:t xml:space="preserve"> is implemented to enable a system of distributed databases, and </w:t>
       </w:r>
       <w:r>
         <w:rPr>
@@ -1086,7 +1104,25 @@
           <w:sz w:val="22"/>
           <w:szCs w:val="22"/>
         </w:rPr>
-        <w:t xml:space="preserve"> To answer the research question, we propose implementing a middleware that enables a system of distributed databases using consistent hash sharding in Redis key-value stores. We will evaluate the performance of this implementation using benchmarking techniques and compare it to traditional databases and other sharding approaches.</w:t>
+        <w:t xml:space="preserve"> To answer the research question, we propose implementing </w:t>
+      </w:r>
+      <w:proofErr w:type="gramStart"/>
+      <w:r>
+        <w:rPr>
+          <w:rFonts w:asciiTheme="minorHAnsi" w:hAnsiTheme="minorHAnsi" w:cstheme="minorHAnsi"/>
+          <w:sz w:val="22"/>
+          <w:szCs w:val="22"/>
+        </w:rPr>
+        <w:t>a middleware</w:t>
+      </w:r>
+      <w:proofErr w:type="gramEnd"/>
+      <w:r>
+        <w:rPr>
+          <w:rFonts w:asciiTheme="minorHAnsi" w:hAnsiTheme="minorHAnsi" w:cstheme="minorHAnsi"/>
+          <w:sz w:val="22"/>
+          <w:szCs w:val="22"/>
+        </w:rPr>
+        <w:t xml:space="preserve"> that enables a system of distributed databases using consistent hash sharding in Redis key-value stores. We will evaluate the performance of this implementation using benchmarking techniques and compare it to traditional databases and other sharding approaches.</w:t>
       </w:r>
     </w:p>
     <w:p>
@@ -1303,94 +1339,68 @@
         <w:rPr>
           <w:rFonts w:cstheme="minorHAnsi"/>
         </w:rPr>
+        <w:t xml:space="preserve"> A parallel database system seeks to improve performance through the parallelization of various operations, such as loading data, building indexes, and evaluating queries. Although data can be stored in a distributed fashion in such a system, the distribution is governed solely by performance considerations.</w:t>
+      </w:r>
+    </w:p>
+    <w:p>
+      <w:pPr>
+        <w:jc w:val="both"/>
+        <w:rPr>
+          <w:rFonts w:cstheme="minorHAnsi"/>
+        </w:rPr>
+      </w:pPr>
+      <w:r>
+        <w:rPr>
+          <w:rFonts w:cstheme="minorHAnsi"/>
+        </w:rPr>
+        <w:t xml:space="preserve">In a distributed database system, </w:t>
+      </w:r>
+      <w:proofErr w:type="gramStart"/>
+      <w:r>
+        <w:rPr>
+          <w:rFonts w:cstheme="minorHAnsi"/>
+        </w:rPr>
+        <w:t>data,</w:t>
+      </w:r>
+      <w:proofErr w:type="gramEnd"/>
+      <w:r>
+        <w:rPr>
+          <w:rFonts w:cstheme="minorHAnsi"/>
+        </w:rPr>
+        <w:t xml:space="preserve"> is physically stored across several sites, and each site is typically managed by DBMS capable of running independent of the other sites. The location of data items and the degree of autonomy of individual sites have a significant impact on all aspects of a system, including query optimization and processing, concurrency control, and recovery. In contrast to parallel databases, the distribution of data is governed by factors such </w:t>
+      </w:r>
+      <w:r>
+        <w:rPr>
+          <w:rFonts w:cstheme="minorHAnsi"/>
+        </w:rPr>
+        <w:t xml:space="preserve">as </w:t>
+      </w:r>
+      <w:r>
+        <w:rPr>
+          <w:rFonts w:cstheme="minorHAnsi"/>
+        </w:rPr>
+        <w:t xml:space="preserve">local ownership and </w:t>
+      </w:r>
+      <w:proofErr w:type="gramStart"/>
+      <w:r>
+        <w:rPr>
+          <w:rFonts w:cstheme="minorHAnsi"/>
+        </w:rPr>
+        <w:t xml:space="preserve">increased </w:t>
+      </w:r>
+      <w:r>
+        <w:rPr>
+          <w:rFonts w:cstheme="minorHAnsi"/>
+        </w:rPr>
         <w:t xml:space="preserve"> </w:t>
       </w:r>
       <w:r>
         <w:rPr>
           <w:rFonts w:cstheme="minorHAnsi"/>
         </w:rPr>
-        <w:t>A parallel database system seeks to improve performance through the parallelization of various operations, such as loading data, building indexes, and evaluating queries. Although data can be stored in a distributed fashion in such a system, the distribution is governed solely by performance considerations.</w:t>
-      </w:r>
-    </w:p>
-    <w:p>
-      <w:pPr>
-        <w:jc w:val="both"/>
-        <w:rPr>
-          <w:rFonts w:cstheme="minorHAnsi"/>
-        </w:rPr>
-      </w:pPr>
-      <w:r>
-        <w:rPr>
-          <w:rFonts w:cstheme="minorHAnsi"/>
-        </w:rPr>
-        <w:t xml:space="preserve">In a distributed database system, data, is physically stored across several sites, and each site is typically managed by DBMS capable of running independent of the other sites. The location of data items and the degree of autonomy of individual sites have a significant impact on all aspects of a system, including query optimization and processing, concurrency control, and recovery. In </w:t>
-      </w:r>
-      <w:r>
-        <w:rPr>
-          <w:rFonts w:cstheme="minorHAnsi"/>
-        </w:rPr>
-        <w:t>contrast</w:t>
-      </w:r>
-      <w:r>
-        <w:rPr>
-          <w:rFonts w:cstheme="minorHAnsi"/>
-        </w:rPr>
-        <w:t xml:space="preserve"> to parallel </w:t>
-      </w:r>
-      <w:r>
-        <w:rPr>
-          <w:rFonts w:cstheme="minorHAnsi"/>
-        </w:rPr>
-        <w:t>databases</w:t>
-      </w:r>
-      <w:r>
-        <w:rPr>
-          <w:rFonts w:cstheme="minorHAnsi"/>
-        </w:rPr>
-        <w:t xml:space="preserve">, the distribution of data is governed by factors </w:t>
-      </w:r>
-      <w:r>
-        <w:rPr>
-          <w:rFonts w:cstheme="minorHAnsi"/>
-        </w:rPr>
-        <w:t xml:space="preserve">such </w:t>
-      </w:r>
-      <w:r>
-        <w:rPr>
-          <w:rFonts w:cstheme="minorHAnsi"/>
-        </w:rPr>
-        <w:t xml:space="preserve">as </w:t>
-      </w:r>
-      <w:r>
-        <w:rPr>
-          <w:rFonts w:cstheme="minorHAnsi"/>
-        </w:rPr>
-        <w:t>local</w:t>
-      </w:r>
-      <w:r>
-        <w:rPr>
-          <w:rFonts w:cstheme="minorHAnsi"/>
-        </w:rPr>
-        <w:t xml:space="preserve"> ownership and </w:t>
-      </w:r>
-      <w:r>
-        <w:rPr>
-          <w:rFonts w:cstheme="minorHAnsi"/>
-        </w:rPr>
-        <w:t xml:space="preserve">increased </w:t>
-      </w:r>
-      <w:r>
-        <w:rPr>
-          <w:rFonts w:cstheme="minorHAnsi"/>
-        </w:rPr>
-        <w:t xml:space="preserve"> </w:t>
-      </w:r>
-      <w:r>
-        <w:rPr>
-          <w:rFonts w:cstheme="minorHAnsi"/>
-        </w:rPr>
         <w:t>availability</w:t>
       </w:r>
+      <w:proofErr w:type="gramEnd"/>
       <w:r>
         <w:rPr>
           <w:rFonts w:cstheme="minorHAnsi"/>
@@ -1739,8 +1749,16 @@
         <w:rPr>
           <w:rFonts w:cstheme="minorHAnsi"/>
         </w:rPr>
-        <w:t xml:space="preserve"> sharding</w:t>
-      </w:r>
+        <w:t xml:space="preserve"> </w:t>
+      </w:r>
+      <w:proofErr w:type="gramStart"/>
+      <w:r>
+        <w:rPr>
+          <w:rFonts w:cstheme="minorHAnsi"/>
+        </w:rPr>
+        <w:t>sharding</w:t>
+      </w:r>
+      <w:proofErr w:type="gramEnd"/>
       <w:r>
         <w:rPr>
           <w:rFonts w:cstheme="minorHAnsi"/>
@@ -1805,7 +1823,14 @@
         <w:rPr>
           <w:rFonts w:cstheme="minorHAnsi"/>
         </w:rPr>
-        <w:t>. This can be particularly important for mission-critical systems that nee</w:t>
+        <w:t xml:space="preserve">. This can be particularly important for mission-critical systems that </w:t>
+      </w:r>
+      <w:proofErr w:type="gramStart"/>
+      <w:r>
+        <w:rPr>
+          <w:rFonts w:cstheme="minorHAnsi"/>
+        </w:rPr>
+        <w:t>nee</w:t>
       </w:r>
       <w:r>
         <w:rPr>
@@ -1817,7 +1842,14 @@
         <w:rPr>
           <w:rFonts w:cstheme="minorHAnsi"/>
         </w:rPr>
-        <w:t xml:space="preserve">highly </w:t>
+        <w:t>highly</w:t>
+      </w:r>
+      <w:proofErr w:type="gramEnd"/>
+      <w:r>
+        <w:rPr>
+          <w:rFonts w:cstheme="minorHAnsi"/>
+        </w:rPr>
+        <w:t xml:space="preserve"> </w:t>
       </w:r>
       <w:r>
         <w:rPr>
@@ -2327,7 +2359,21 @@
         <w:rPr>
           <w:rFonts w:cstheme="minorHAnsi"/>
         </w:rPr>
-        <w:t xml:space="preserve">: Data hotspot is a common problem that occurs when a particular set of data receives a disproportionate amount of access compared to other data. This can lead to performance issues, as the sites that store the hot data may become overloaded and unable to handle the increased workload from the system. Data hotspot is mainly caused due to skewed data distribution among the sites during sharding. If the data is not evenly distributed among the sites, some sites may end up with more data than others, leading to hotspots. </w:t>
+        <w:t xml:space="preserve">: Data </w:t>
+      </w:r>
+      <w:proofErr w:type="gramStart"/>
+      <w:r>
+        <w:rPr>
+          <w:rFonts w:cstheme="minorHAnsi"/>
+        </w:rPr>
+        <w:t>hotspot is</w:t>
+      </w:r>
+      <w:proofErr w:type="gramEnd"/>
+      <w:r>
+        <w:rPr>
+          <w:rFonts w:cstheme="minorHAnsi"/>
+        </w:rPr>
+        <w:t xml:space="preserve"> a common problem that occurs when a particular set of data receives a disproportionate amount of access compared to other data. This can lead to performance issues, as the sites that store the hot data may become overloaded and unable to handle the increased workload from the system. Data hotspot is mainly caused due to skewed data distribution among the sites during sharding. If the data is not evenly distributed among the sites, some sites may end up with more data than others, leading to hotspots. </w:t>
       </w:r>
     </w:p>
     <w:p>
@@ -2880,6 +2926,325 @@
     </w:p>
     <w:p>
       <w:pPr>
+        <w:pStyle w:val="ListParagraph"/>
+        <w:numPr>
+          <w:ilvl w:val="0"/>
+          <w:numId w:val="16"/>
+        </w:numPr>
+        <w:spacing w:line="360" w:lineRule="auto"/>
+        <w:jc w:val="both"/>
+      </w:pPr>
+      <w:r>
+        <w:t xml:space="preserve">In 1999, Pattishall (Pat06) proposed his unorthodox approach to database design. Pattishall argued that by splitting the data among multiple servers, it would provide more write bandwidth as well as high availability. Since each share of the data </w:t>
+      </w:r>
+      <w:r>
+        <w:t>or shard is small</w:t>
+      </w:r>
+      <w:r>
+        <w:t xml:space="preserve">, data will be faster to backup, recover, and easier to manage. </w:t>
+      </w:r>
+    </w:p>
+    <w:p>
+      <w:pPr>
+        <w:pStyle w:val="ListParagraph"/>
+        <w:numPr>
+          <w:ilvl w:val="0"/>
+          <w:numId w:val="16"/>
+        </w:numPr>
+        <w:spacing w:line="360" w:lineRule="auto"/>
+        <w:jc w:val="both"/>
+      </w:pPr>
+      <w:r>
+        <w:t>Obasanjo (Oba</w:t>
+      </w:r>
+      <w:proofErr w:type="gramStart"/>
+      <w:r>
+        <w:t>09)discussed</w:t>
+      </w:r>
+      <w:proofErr w:type="gramEnd"/>
+      <w:r>
+        <w:t xml:space="preserve"> the challenges Facebook Inc. encountered with its data storage as it transitioned from a glorified online Harvard’s yearbook, in 2004,to a 14 billion page views per month, in 2008.Obasanjo mentioned at some point during the development of Facebook, that the limitation on the physical capacity of their database server was at its maximum. To continue and expand the operation, Facebook had to either scale up by procuring bigger and better database servers with more RAM, higher CPU frequency and cores, and more storage capacity, or scale out by distributing their data across relatively cheap commodity database servers. The scenario presents sharding as the best alternative with regards to cost savings relative to the increased complexity of the system (Oba09).</w:t>
+      </w:r>
+    </w:p>
+    <w:p>
+      <w:pPr>
+        <w:pStyle w:val="NormalWeb"/>
+        <w:jc w:val="both"/>
+        <w:rPr>
+          <w:rFonts w:asciiTheme="minorHAnsi" w:hAnsiTheme="minorHAnsi" w:cstheme="minorHAnsi"/>
+          <w:sz w:val="22"/>
+          <w:szCs w:val="22"/>
+        </w:rPr>
+      </w:pPr>
+    </w:p>
+    <w:p>
+      <w:pPr>
+        <w:pStyle w:val="ListParagraph"/>
+        <w:numPr>
+          <w:ilvl w:val="0"/>
+          <w:numId w:val="16"/>
+        </w:numPr>
+        <w:autoSpaceDE w:val="0"/>
+        <w:autoSpaceDN w:val="0"/>
+        <w:adjustRightInd w:val="0"/>
+        <w:spacing w:after="0" w:line="360" w:lineRule="auto"/>
+        <w:rPr>
+          <w:rFonts w:cstheme="minorHAnsi"/>
+        </w:rPr>
+      </w:pPr>
+      <w:r>
+        <w:rPr>
+          <w:rFonts w:cstheme="minorHAnsi"/>
+        </w:rPr>
+        <w:t>Some of the common architectural models are −</w:t>
+      </w:r>
+    </w:p>
+    <w:p>
+      <w:pPr>
+        <w:pStyle w:val="ListParagraph"/>
+        <w:numPr>
+          <w:ilvl w:val="0"/>
+          <w:numId w:val="16"/>
+        </w:numPr>
+        <w:autoSpaceDE w:val="0"/>
+        <w:autoSpaceDN w:val="0"/>
+        <w:adjustRightInd w:val="0"/>
+        <w:spacing w:after="0" w:line="360" w:lineRule="auto"/>
+        <w:rPr>
+          <w:rFonts w:cstheme="minorHAnsi"/>
+        </w:rPr>
+      </w:pPr>
+      <w:r>
+        <w:rPr>
+          <w:rFonts w:cstheme="minorHAnsi"/>
+        </w:rPr>
+        <w:t>Client-Server Architecture (also Single-Server-Multiple-Clients and Multiple-</w:t>
+      </w:r>
+    </w:p>
+    <w:p>
+      <w:pPr>
+        <w:pStyle w:val="ListParagraph"/>
+        <w:numPr>
+          <w:ilvl w:val="0"/>
+          <w:numId w:val="16"/>
+        </w:numPr>
+        <w:autoSpaceDE w:val="0"/>
+        <w:autoSpaceDN w:val="0"/>
+        <w:adjustRightInd w:val="0"/>
+        <w:spacing w:after="0" w:line="360" w:lineRule="auto"/>
+        <w:rPr>
+          <w:rFonts w:cstheme="minorHAnsi"/>
+        </w:rPr>
+      </w:pPr>
+      <w:r>
+        <w:rPr>
+          <w:rFonts w:cstheme="minorHAnsi"/>
+        </w:rPr>
+        <w:t>Servers- Multiple-Clients) / Centralized DBMS: one dedicated coordinator node of the</w:t>
+      </w:r>
+    </w:p>
+    <w:p>
+      <w:pPr>
+        <w:pStyle w:val="ListParagraph"/>
+        <w:numPr>
+          <w:ilvl w:val="0"/>
+          <w:numId w:val="16"/>
+        </w:numPr>
+        <w:autoSpaceDE w:val="0"/>
+        <w:autoSpaceDN w:val="0"/>
+        <w:adjustRightInd w:val="0"/>
+        <w:spacing w:after="0" w:line="360" w:lineRule="auto"/>
+        <w:rPr>
+          <w:rFonts w:cstheme="minorHAnsi"/>
+        </w:rPr>
+      </w:pPr>
+      <w:r>
+        <w:rPr>
+          <w:rFonts w:cstheme="minorHAnsi"/>
+        </w:rPr>
+        <w:t>cluster</w:t>
+      </w:r>
+    </w:p>
+    <w:p>
+      <w:pPr>
+        <w:pStyle w:val="ListParagraph"/>
+        <w:numPr>
+          <w:ilvl w:val="0"/>
+          <w:numId w:val="16"/>
+        </w:numPr>
+        <w:autoSpaceDE w:val="0"/>
+        <w:autoSpaceDN w:val="0"/>
+        <w:adjustRightInd w:val="0"/>
+        <w:spacing w:after="0" w:line="360" w:lineRule="auto"/>
+        <w:rPr>
+          <w:rFonts w:cstheme="minorHAnsi"/>
+        </w:rPr>
+      </w:pPr>
+      <w:r>
+        <w:rPr>
+          <w:rFonts w:cstheme="minorHAnsi"/>
+        </w:rPr>
+        <w:t xml:space="preserve">compiles/optimizes query but all nodes are used to run query in </w:t>
+      </w:r>
+      <w:proofErr w:type="gramStart"/>
+      <w:r>
+        <w:rPr>
+          <w:rFonts w:cstheme="minorHAnsi"/>
+        </w:rPr>
+        <w:t>parallel</w:t>
+      </w:r>
+      <w:proofErr w:type="gramEnd"/>
+    </w:p>
+    <w:p>
+      <w:pPr>
+        <w:pStyle w:val="ListParagraph"/>
+        <w:numPr>
+          <w:ilvl w:val="0"/>
+          <w:numId w:val="16"/>
+        </w:numPr>
+        <w:autoSpaceDE w:val="0"/>
+        <w:autoSpaceDN w:val="0"/>
+        <w:adjustRightInd w:val="0"/>
+        <w:spacing w:after="0" w:line="360" w:lineRule="auto"/>
+        <w:rPr>
+          <w:rFonts w:cstheme="minorHAnsi"/>
+        </w:rPr>
+      </w:pPr>
+      <w:r>
+        <w:rPr>
+          <w:rFonts w:cstheme="minorHAnsi"/>
+        </w:rPr>
+        <w:t>Peer-to-Peer Architecture for DDBMS</w:t>
+      </w:r>
+    </w:p>
+    <w:p>
+      <w:pPr>
+        <w:pStyle w:val="ListParagraph"/>
+        <w:numPr>
+          <w:ilvl w:val="0"/>
+          <w:numId w:val="16"/>
+        </w:numPr>
+        <w:spacing w:line="360" w:lineRule="auto"/>
+        <w:jc w:val="both"/>
+        <w:rPr>
+          <w:rFonts w:cstheme="minorHAnsi"/>
+        </w:rPr>
+      </w:pPr>
+      <w:r>
+        <w:rPr>
+          <w:rFonts w:cstheme="minorHAnsi"/>
+        </w:rPr>
+        <w:t>Multi-DBMS Architecture</w:t>
+      </w:r>
+    </w:p>
+    <w:p>
+      <w:pPr>
+        <w:pStyle w:val="NormalWeb"/>
+        <w:jc w:val="both"/>
+        <w:rPr>
+          <w:rFonts w:asciiTheme="minorHAnsi" w:hAnsiTheme="minorHAnsi" w:cstheme="minorHAnsi"/>
+          <w:sz w:val="22"/>
+          <w:szCs w:val="22"/>
+        </w:rPr>
+      </w:pPr>
+    </w:p>
+    <w:p>
+      <w:pPr>
+        <w:spacing w:line="360" w:lineRule="auto"/>
+        <w:jc w:val="both"/>
+        <w:rPr>
+          <w:rFonts w:cstheme="minorHAnsi"/>
+        </w:rPr>
+      </w:pPr>
+      <w:r>
+        <w:rPr>
+          <w:rFonts w:cstheme="minorHAnsi"/>
+        </w:rPr>
+        <w:t xml:space="preserve">The location of data items and the degree of autonomy of individual sites have a significant impact on all aspects of the system, including query optimization and processing, concurrency control, and recovery. </w:t>
+      </w:r>
+      <w:commentRangeStart w:id="1"/>
+      <w:r>
+        <w:rPr>
+          <w:rFonts w:cstheme="minorHAnsi"/>
+        </w:rPr>
+        <w:t>The distribution of data among different physical sites in a computer network clearly adds to the system’s complexity, where the partitioning of the data into database fragments must be carefully considered</w:t>
+      </w:r>
+      <w:commentRangeEnd w:id="1"/>
+      <w:r>
+        <w:rPr>
+          <w:rStyle w:val="CommentReference"/>
+          <w:rFonts w:cstheme="minorHAnsi"/>
+          <w:sz w:val="22"/>
+          <w:szCs w:val="22"/>
+        </w:rPr>
+        <w:commentReference w:id="1"/>
+      </w:r>
+      <w:r>
+        <w:rPr>
+          <w:rFonts w:cstheme="minorHAnsi"/>
+        </w:rPr>
+        <w:t xml:space="preserve">. </w:t>
+      </w:r>
+    </w:p>
+    <w:p>
+      <w:pPr>
+        <w:spacing w:line="360" w:lineRule="auto"/>
+        <w:jc w:val="both"/>
+        <w:rPr>
+          <w:rFonts w:cstheme="minorHAnsi"/>
+        </w:rPr>
+      </w:pPr>
+      <w:r>
+        <w:rPr>
+          <w:rFonts w:cstheme="minorHAnsi"/>
+        </w:rPr>
+        <w:t>In distributed databases, data can be located near the greatest demand’s site. Data is dispersed to match the user’s requirements. This enables faster data access and spreads the system’s workload by processing data across several physical database nodes.</w:t>
+      </w:r>
+      <w:r>
+        <w:rPr>
+          <w:rFonts w:cstheme="minorHAnsi"/>
+        </w:rPr>
+        <w:t xml:space="preserve"> </w:t>
+      </w:r>
+      <w:r>
+        <w:t>The i</w:t>
+      </w:r>
+      <w:commentRangeStart w:id="2"/>
+      <w:r>
+        <w:t>nherent parallelism of distributed systems may be exploited for interquery and intraquery parallelism. Interquery parallelism enables the parallel execution of multiple queries generated by concurrent transactions, to increase the transactional throughput. Intraquery parallelism in distributed DBMSs is achieved by breaking up a single query into a number</w:t>
+      </w:r>
+      <w:r>
+        <w:br/>
+        <w:t>of subqueries, each of which is executed at a different site, accessing a different</w:t>
+      </w:r>
+      <w:r>
+        <w:br/>
+        <w:t>part of the distributed database.</w:t>
+      </w:r>
+      <w:commentRangeEnd w:id="2"/>
+      <w:r>
+        <w:rPr>
+          <w:rStyle w:val="CommentReference"/>
+        </w:rPr>
+        <w:commentReference w:id="2"/>
+      </w:r>
+      <w:r>
+        <w:t xml:space="preserve"> This thesis focuses on the intraquery parallelism which enables the sharded distributed databases.</w:t>
+      </w:r>
+    </w:p>
+    <w:p>
+      <w:pPr>
+        <w:pStyle w:val="NormalWeb"/>
+        <w:jc w:val="both"/>
+        <w:rPr>
+          <w:rFonts w:asciiTheme="minorHAnsi" w:hAnsiTheme="minorHAnsi" w:cstheme="minorHAnsi"/>
+          <w:sz w:val="22"/>
+          <w:szCs w:val="22"/>
+        </w:rPr>
+      </w:pPr>
+    </w:p>
+    <w:p>
+      <w:pPr>
         <w:jc w:val="both"/>
         <w:rPr>
           <w:rFonts w:cstheme="minorHAnsi"/>
@@ -3011,6 +3376,7 @@
         <w:rPr>
           <w:rFonts w:cstheme="minorHAnsi"/>
         </w:rPr>
+        <w:lastRenderedPageBreak/>
         <w:t>Before sharding, one should determine</w:t>
       </w:r>
       <w:r>
@@ -3023,7 +3389,21 @@
         <w:rPr>
           <w:rFonts w:cstheme="minorHAnsi"/>
         </w:rPr>
-        <w:t xml:space="preserve"> Shard key determines which data are grouped together. Shard key is, either selected from an existing key in the dataset </w:t>
+        <w:t xml:space="preserve"> Shard key determines which data are grouped together. </w:t>
+      </w:r>
+      <w:proofErr w:type="gramStart"/>
+      <w:r>
+        <w:rPr>
+          <w:rFonts w:cstheme="minorHAnsi"/>
+        </w:rPr>
+        <w:t>Shard</w:t>
+      </w:r>
+      <w:proofErr w:type="gramEnd"/>
+      <w:r>
+        <w:rPr>
+          <w:rFonts w:cstheme="minorHAnsi"/>
+        </w:rPr>
+        <w:t xml:space="preserve"> key is, either selected from an existing key in the dataset </w:t>
       </w:r>
       <w:r>
         <w:rPr>
@@ -3124,7 +3504,6 @@
         <w:rPr>
           <w:rFonts w:cstheme="minorHAnsi"/>
         </w:rPr>
-        <w:lastRenderedPageBreak/>
         <w:t xml:space="preserve">Range-based </w:t>
       </w:r>
       <w:r>
@@ -3188,7 +3567,21 @@
         <w:rPr>
           <w:rFonts w:cstheme="minorHAnsi"/>
         </w:rPr>
-        <w:t>site, resulting an uneven distribution of data</w:t>
+        <w:t xml:space="preserve">site, </w:t>
+      </w:r>
+      <w:proofErr w:type="gramStart"/>
+      <w:r>
+        <w:rPr>
+          <w:rFonts w:cstheme="minorHAnsi"/>
+        </w:rPr>
+        <w:t>resulting</w:t>
+      </w:r>
+      <w:proofErr w:type="gramEnd"/>
+      <w:r>
+        <w:rPr>
+          <w:rFonts w:cstheme="minorHAnsi"/>
+        </w:rPr>
+        <w:t xml:space="preserve"> an uneven distribution of data</w:t>
       </w:r>
       <w:r>
         <w:rPr>
@@ -3366,7 +3759,21 @@
         <w:rPr>
           <w:rFonts w:cstheme="minorHAnsi"/>
         </w:rPr>
-        <w:t xml:space="preserve">In hash-based sharding, a hash function is used to determine which site, a piece of data (shard) should be stored in. The hash function takes a key (such as a user ID) as input and produces a hash value that is used to determine which site the data should be stored on. This type of sharding is useful when the data does not have a natural key range and when it is important to evenly distribute the data across the sites. </w:t>
+        <w:t xml:space="preserve">In hash-based sharding, a hash function is used to determine which </w:t>
+      </w:r>
+      <w:proofErr w:type="gramStart"/>
+      <w:r>
+        <w:rPr>
+          <w:rFonts w:cstheme="minorHAnsi"/>
+        </w:rPr>
+        <w:t>site,</w:t>
+      </w:r>
+      <w:proofErr w:type="gramEnd"/>
+      <w:r>
+        <w:rPr>
+          <w:rFonts w:cstheme="minorHAnsi"/>
+        </w:rPr>
+        <w:t xml:space="preserve"> a piece of data (shard) should be stored in. The hash function takes a key (such as a user ID) as input and produces a hash value that is used to determine which site the data should be stored on. This type of sharding is useful when the data does not have a natural key range and when it is important to evenly distribute the data across the sites. </w:t>
       </w:r>
       <w:r>
         <w:rPr>
@@ -3384,7 +3791,21 @@
         <w:rPr>
           <w:rFonts w:cstheme="minorHAnsi"/>
         </w:rPr>
-        <w:t xml:space="preserve"> sharding results in even data distribution among physical shards, it does not </w:t>
+        <w:t xml:space="preserve"> sharding results </w:t>
+      </w:r>
+      <w:proofErr w:type="gramStart"/>
+      <w:r>
+        <w:rPr>
+          <w:rFonts w:cstheme="minorHAnsi"/>
+        </w:rPr>
+        <w:t>in even</w:t>
+      </w:r>
+      <w:proofErr w:type="gramEnd"/>
+      <w:r>
+        <w:rPr>
+          <w:rFonts w:cstheme="minorHAnsi"/>
+        </w:rPr>
+        <w:t xml:space="preserve"> data distribution among physical shards, it does not </w:t>
       </w:r>
       <w:r>
         <w:rPr>
@@ -3589,6 +4010,7 @@
         <w:rPr>
           <w:rFonts w:cstheme="minorHAnsi"/>
         </w:rPr>
+        <w:lastRenderedPageBreak/>
         <w:t>When a data overload occurs on specific physical shards although others remain underloaded, it results in database hotspots. Hotspots slow down the retrieval process on the database, defeating the purpose of data sharding. </w:t>
       </w:r>
     </w:p>
@@ -3622,7 +4044,6 @@
         <w:rPr>
           <w:rFonts w:cstheme="minorHAnsi"/>
         </w:rPr>
-        <w:lastRenderedPageBreak/>
         <w:t>Cardinality:</w:t>
       </w:r>
       <w:r>
@@ -3846,7 +4267,22 @@
         <w:rPr>
           <w:rFonts w:cstheme="minorHAnsi"/>
         </w:rPr>
-        <w:t>Proxy assisted sharding (Middleware): Clients send request to the middleware that supports Redis protocol, instead of sending requests directly to the right Redis instances.</w:t>
+        <w:lastRenderedPageBreak/>
+        <w:t xml:space="preserve">Proxy assisted sharding (Middleware): Clients send </w:t>
+      </w:r>
+      <w:proofErr w:type="gramStart"/>
+      <w:r>
+        <w:rPr>
+          <w:rFonts w:cstheme="minorHAnsi"/>
+        </w:rPr>
+        <w:t>request</w:t>
+      </w:r>
+      <w:proofErr w:type="gramEnd"/>
+      <w:r>
+        <w:rPr>
+          <w:rFonts w:cstheme="minorHAnsi"/>
+        </w:rPr>
+        <w:t xml:space="preserve"> to the middleware that supports Redis protocol, instead of sending requests directly to the right Redis instances.</w:t>
       </w:r>
     </w:p>
     <w:p>
@@ -3911,7 +4347,6 @@
         <w:rPr>
           <w:rFonts w:eastAsia="Calibri" w:cstheme="minorHAnsi"/>
         </w:rPr>
-        <w:lastRenderedPageBreak/>
         <w:t xml:space="preserve">Key-space utilization: hit rate = </w:t>
       </w:r>
       <w:proofErr w:type="spellStart"/>
@@ -3972,8 +4407,16 @@
         <w:rPr>
           <w:rFonts w:eastAsia="Calibri" w:cstheme="minorHAnsi"/>
         </w:rPr>
-        <w:t>Operation performance: time taken to perform with respect to magnitude of operations performed (throughput), i.e., average response time per query</w:t>
-      </w:r>
+        <w:t xml:space="preserve">Operation performance: time taken to perform with respect to magnitude of operations performed (throughput), i.e., average response time per </w:t>
+      </w:r>
+      <w:proofErr w:type="gramStart"/>
+      <w:r>
+        <w:rPr>
+          <w:rFonts w:eastAsia="Calibri" w:cstheme="minorHAnsi"/>
+        </w:rPr>
+        <w:t>query</w:t>
+      </w:r>
+      <w:proofErr w:type="gramEnd"/>
     </w:p>
     <w:p>
       <w:pPr>
@@ -4007,6 +4450,7 @@
         <w:t xml:space="preserve">, round-trip </w:t>
       </w:r>
       <w:proofErr w:type="spellStart"/>
+      <w:proofErr w:type="gramStart"/>
       <w:r>
         <w:rPr>
           <w:rFonts w:eastAsia="Calibri" w:cstheme="minorHAnsi"/>
@@ -4014,6 +4458,7 @@
         <w:t>time;request</w:t>
       </w:r>
       <w:proofErr w:type="spellEnd"/>
+      <w:proofErr w:type="gramEnd"/>
       <w:r>
         <w:rPr>
           <w:rFonts w:eastAsia="Calibri" w:cstheme="minorHAnsi"/>
@@ -4216,6 +4661,144 @@
         </w:rPr>
         <w:br w:type="page"/>
       </w:r>
+    </w:p>
+    <w:p>
+      <w:pPr>
+        <w:rPr>
+          <w:rFonts w:cstheme="minorHAnsi"/>
+        </w:rPr>
+      </w:pPr>
+    </w:p>
+    <w:p>
+      <w:pPr>
+        <w:autoSpaceDE w:val="0"/>
+        <w:autoSpaceDN w:val="0"/>
+        <w:adjustRightInd w:val="0"/>
+        <w:spacing w:after="0" w:line="360" w:lineRule="auto"/>
+        <w:rPr>
+          <w:rFonts w:cstheme="minorHAnsi"/>
+        </w:rPr>
+      </w:pPr>
+      <w:r>
+        <w:rPr>
+          <w:rFonts w:cstheme="minorHAnsi"/>
+        </w:rPr>
+        <w:t>The partitioned data chunks are called logical shards. The machine that stores the logical</w:t>
+      </w:r>
+    </w:p>
+    <w:p>
+      <w:pPr>
+        <w:autoSpaceDE w:val="0"/>
+        <w:autoSpaceDN w:val="0"/>
+        <w:adjustRightInd w:val="0"/>
+        <w:spacing w:after="0" w:line="360" w:lineRule="auto"/>
+        <w:rPr>
+          <w:rFonts w:cstheme="minorHAnsi"/>
+        </w:rPr>
+      </w:pPr>
+      <w:r>
+        <w:rPr>
+          <w:rFonts w:cstheme="minorHAnsi"/>
+        </w:rPr>
+        <w:t xml:space="preserve">shard is called a physical shard or database node. A physical shard can contain </w:t>
+      </w:r>
+      <w:proofErr w:type="gramStart"/>
+      <w:r>
+        <w:rPr>
+          <w:rFonts w:cstheme="minorHAnsi"/>
+        </w:rPr>
+        <w:t>multiple</w:t>
+      </w:r>
+      <w:proofErr w:type="gramEnd"/>
+    </w:p>
+    <w:p>
+      <w:pPr>
+        <w:autoSpaceDE w:val="0"/>
+        <w:autoSpaceDN w:val="0"/>
+        <w:adjustRightInd w:val="0"/>
+        <w:spacing w:after="0" w:line="360" w:lineRule="auto"/>
+        <w:rPr>
+          <w:rFonts w:cstheme="minorHAnsi"/>
+        </w:rPr>
+      </w:pPr>
+      <w:r>
+        <w:rPr>
+          <w:rFonts w:cstheme="minorHAnsi"/>
+        </w:rPr>
+        <w:t>logical shards.</w:t>
+      </w:r>
+    </w:p>
+    <w:p>
+      <w:pPr>
+        <w:autoSpaceDE w:val="0"/>
+        <w:autoSpaceDN w:val="0"/>
+        <w:adjustRightInd w:val="0"/>
+        <w:spacing w:after="0" w:line="360" w:lineRule="auto"/>
+        <w:rPr>
+          <w:rFonts w:cstheme="minorHAnsi"/>
+        </w:rPr>
+      </w:pPr>
+      <w:r>
+        <w:rPr>
+          <w:rFonts w:cstheme="minorHAnsi"/>
+        </w:rPr>
+        <w:t>Software developers use a shard key to determine how to partition the dataset. A column</w:t>
+      </w:r>
+    </w:p>
+    <w:p>
+      <w:pPr>
+        <w:autoSpaceDE w:val="0"/>
+        <w:autoSpaceDN w:val="0"/>
+        <w:adjustRightInd w:val="0"/>
+        <w:spacing w:after="0" w:line="360" w:lineRule="auto"/>
+        <w:rPr>
+          <w:rFonts w:cstheme="minorHAnsi"/>
+        </w:rPr>
+      </w:pPr>
+      <w:r>
+        <w:rPr>
+          <w:rFonts w:cstheme="minorHAnsi"/>
+        </w:rPr>
+        <w:t xml:space="preserve">in the dataset determines which rows of data group together to form a </w:t>
+      </w:r>
+      <w:proofErr w:type="spellStart"/>
+      <w:r>
+        <w:rPr>
+          <w:rFonts w:cstheme="minorHAnsi"/>
+        </w:rPr>
+        <w:t>shard</w:t>
+      </w:r>
+      <w:proofErr w:type="spellEnd"/>
+      <w:r>
+        <w:rPr>
+          <w:rFonts w:cstheme="minorHAnsi"/>
+        </w:rPr>
+        <w:t>. Database</w:t>
+      </w:r>
+    </w:p>
+    <w:p>
+      <w:pPr>
+        <w:autoSpaceDE w:val="0"/>
+        <w:autoSpaceDN w:val="0"/>
+        <w:adjustRightInd w:val="0"/>
+        <w:spacing w:after="0" w:line="360" w:lineRule="auto"/>
+        <w:rPr>
+          <w:rFonts w:cstheme="minorHAnsi"/>
+        </w:rPr>
+      </w:pPr>
+      <w:r>
+        <w:rPr>
+          <w:rFonts w:cstheme="minorHAnsi"/>
+        </w:rPr>
+        <w:t>designers choose a shard key from an existing column or create a new one.</w:t>
+      </w:r>
+    </w:p>
+    <w:p>
+      <w:pPr>
+        <w:rPr>
+          <w:rFonts w:cstheme="minorHAnsi"/>
+        </w:rPr>
+      </w:pPr>
     </w:p>
     <w:p>
       <w:pPr>
@@ -4244,7 +4827,6 @@
           <w:b/>
           <w:bCs/>
         </w:rPr>
-        <w:lastRenderedPageBreak/>
         <w:t>Database Middleware Implementation:</w:t>
       </w:r>
     </w:p>
@@ -4708,8 +5290,16 @@
         <w:rPr>
           <w:rFonts w:asciiTheme="minorHAnsi" w:hAnsiTheme="minorHAnsi" w:cstheme="minorHAnsi"/>
         </w:rPr>
-        <w:t>CRUD (Create Read Update Delete) operations</w:t>
-      </w:r>
+        <w:t xml:space="preserve">CRUD (Create Read Update Delete) </w:t>
+      </w:r>
+      <w:proofErr w:type="gramStart"/>
+      <w:r>
+        <w:rPr>
+          <w:rFonts w:asciiTheme="minorHAnsi" w:hAnsiTheme="minorHAnsi" w:cstheme="minorHAnsi"/>
+        </w:rPr>
+        <w:t>operations</w:t>
+      </w:r>
+      <w:proofErr w:type="gramEnd"/>
     </w:p>
     <w:p>
       <w:pPr>
@@ -4780,7 +5370,21 @@
         <w:rPr>
           <w:rFonts w:asciiTheme="minorHAnsi" w:hAnsiTheme="minorHAnsi" w:cstheme="minorHAnsi"/>
         </w:rPr>
-        <w:t>Atomic insertions, updates and deletion</w:t>
+        <w:t xml:space="preserve">Atomic insertions, </w:t>
+      </w:r>
+      <w:proofErr w:type="gramStart"/>
+      <w:r>
+        <w:rPr>
+          <w:rFonts w:asciiTheme="minorHAnsi" w:hAnsiTheme="minorHAnsi" w:cstheme="minorHAnsi"/>
+        </w:rPr>
+        <w:t>updates</w:t>
+      </w:r>
+      <w:proofErr w:type="gramEnd"/>
+      <w:r>
+        <w:rPr>
+          <w:rFonts w:asciiTheme="minorHAnsi" w:hAnsiTheme="minorHAnsi" w:cstheme="minorHAnsi"/>
+        </w:rPr>
+        <w:t xml:space="preserve"> and deletion</w:t>
       </w:r>
     </w:p>
     <w:p>
@@ -4834,8 +5438,16 @@
         <w:rPr>
           <w:rFonts w:asciiTheme="minorHAnsi" w:hAnsiTheme="minorHAnsi" w:cstheme="minorHAnsi"/>
         </w:rPr>
-        <w:t>Exclusion of Byzantine Faults, assuming that malicious sites are not present</w:t>
-      </w:r>
+        <w:t xml:space="preserve">Exclusion of Byzantine Faults, assuming that malicious sites are not </w:t>
+      </w:r>
+      <w:proofErr w:type="gramStart"/>
+      <w:r>
+        <w:rPr>
+          <w:rFonts w:asciiTheme="minorHAnsi" w:hAnsiTheme="minorHAnsi" w:cstheme="minorHAnsi"/>
+        </w:rPr>
+        <w:t>present</w:t>
+      </w:r>
+      <w:proofErr w:type="gramEnd"/>
     </w:p>
     <w:p>
       <w:pPr>
@@ -4999,6 +5611,7 @@
           <w:rFonts w:cstheme="minorHAnsi"/>
           <w:color w:val="000000"/>
         </w:rPr>
+        <w:lastRenderedPageBreak/>
         <w:t>Data sharding:</w:t>
       </w:r>
     </w:p>
@@ -5026,8 +5639,17 @@
           <w:rFonts w:cstheme="minorHAnsi"/>
           <w:color w:val="000000"/>
         </w:rPr>
-        <w:t>Key-based/Hashed-based sharding (Algorithmic sharding) with consistent hashing</w:t>
-      </w:r>
+        <w:t xml:space="preserve">Key-based/Hashed-based sharding (Algorithmic sharding) with consistent </w:t>
+      </w:r>
+      <w:proofErr w:type="gramStart"/>
+      <w:r>
+        <w:rPr>
+          <w:rFonts w:cstheme="minorHAnsi"/>
+          <w:color w:val="000000"/>
+        </w:rPr>
+        <w:t>hashing</w:t>
+      </w:r>
+      <w:proofErr w:type="gramEnd"/>
     </w:p>
     <w:p>
       <w:pPr>
@@ -5242,8 +5864,17 @@
           <w:rFonts w:cstheme="minorHAnsi"/>
           <w:color w:val="000000"/>
         </w:rPr>
-        <w:t>CRUD (Create Read Update Delete) queries including cross-shard joins</w:t>
-      </w:r>
+        <w:t xml:space="preserve">CRUD (Create Read Update Delete) queries including cross-shard </w:t>
+      </w:r>
+      <w:proofErr w:type="gramStart"/>
+      <w:r>
+        <w:rPr>
+          <w:rFonts w:cstheme="minorHAnsi"/>
+          <w:color w:val="000000"/>
+        </w:rPr>
+        <w:t>joins</w:t>
+      </w:r>
+      <w:proofErr w:type="gramEnd"/>
     </w:p>
     <w:p>
       <w:pPr>
@@ -5285,6 +5916,7 @@
         <w:t xml:space="preserve">int </w:t>
       </w:r>
       <w:proofErr w:type="spellStart"/>
+      <w:proofErr w:type="gramStart"/>
       <w:r>
         <w:rPr>
           <w:rFonts w:cstheme="minorHAnsi"/>
@@ -5304,7 +5936,18 @@
           <w:color w:val="000000" w:themeColor="text1"/>
           <w:highlight w:val="lightGray"/>
         </w:rPr>
-        <w:t xml:space="preserve">(int key, int </w:t>
+        <w:t>(</w:t>
+      </w:r>
+      <w:proofErr w:type="gramEnd"/>
+      <w:r>
+        <w:rPr>
+          <w:rFonts w:cstheme="minorHAnsi"/>
+          <w:b/>
+          <w:bCs/>
+          <w:color w:val="000000" w:themeColor="text1"/>
+          <w:highlight w:val="lightGray"/>
+        </w:rPr>
+        <w:t xml:space="preserve">int key, int </w:t>
       </w:r>
       <w:proofErr w:type="spellStart"/>
       <w:r>
@@ -5345,6 +5988,7 @@
         </w:rPr>
       </w:pPr>
       <w:proofErr w:type="spellStart"/>
+      <w:proofErr w:type="gramStart"/>
       <w:r>
         <w:rPr>
           <w:rFonts w:cstheme="minorHAnsi"/>
@@ -5356,6 +6000,7 @@
         <w:t>random.seed</w:t>
       </w:r>
       <w:proofErr w:type="spellEnd"/>
+      <w:proofErr w:type="gramEnd"/>
       <w:r>
         <w:rPr>
           <w:rFonts w:cstheme="minorHAnsi"/>
@@ -5545,6 +6190,7 @@
         <w:t xml:space="preserve">r = </w:t>
       </w:r>
       <w:proofErr w:type="spellStart"/>
+      <w:proofErr w:type="gramStart"/>
       <w:r>
         <w:rPr>
           <w:rFonts w:cstheme="minorHAnsi"/>
@@ -5556,6 +6202,7 @@
         <w:t>random.next</w:t>
       </w:r>
       <w:proofErr w:type="spellEnd"/>
+      <w:proofErr w:type="gramEnd"/>
       <w:r>
         <w:rPr>
           <w:rFonts w:cstheme="minorHAnsi"/>
@@ -5590,7 +6237,29 @@
           <w:color w:val="000000" w:themeColor="text1"/>
           <w:highlight w:val="lightGray"/>
         </w:rPr>
-        <w:t>j = floor((b + 1) / r);</w:t>
+        <w:t xml:space="preserve">j = </w:t>
+      </w:r>
+      <w:proofErr w:type="gramStart"/>
+      <w:r>
+        <w:rPr>
+          <w:rFonts w:cstheme="minorHAnsi"/>
+          <w:b/>
+          <w:bCs/>
+          <w:color w:val="000000" w:themeColor="text1"/>
+          <w:highlight w:val="lightGray"/>
+        </w:rPr>
+        <w:t>floor(</w:t>
+      </w:r>
+      <w:proofErr w:type="gramEnd"/>
+      <w:r>
+        <w:rPr>
+          <w:rFonts w:cstheme="minorHAnsi"/>
+          <w:b/>
+          <w:bCs/>
+          <w:color w:val="000000" w:themeColor="text1"/>
+          <w:highlight w:val="lightGray"/>
+        </w:rPr>
+        <w:t>(b + 1) / r);</w:t>
       </w:r>
     </w:p>
     <w:p>
@@ -5685,7 +6354,21 @@
         <w:rPr>
           <w:rFonts w:cstheme="minorHAnsi"/>
         </w:rPr>
-        <w:t xml:space="preserve">Applications of consistent Hashing : DynamoDB, Cassandra, </w:t>
+        <w:t xml:space="preserve">Applications of consistent </w:t>
+      </w:r>
+      <w:proofErr w:type="gramStart"/>
+      <w:r>
+        <w:rPr>
+          <w:rFonts w:cstheme="minorHAnsi"/>
+        </w:rPr>
+        <w:t>Hashing :</w:t>
+      </w:r>
+      <w:proofErr w:type="gramEnd"/>
+      <w:r>
+        <w:rPr>
+          <w:rFonts w:cstheme="minorHAnsi"/>
+        </w:rPr>
+        <w:t xml:space="preserve"> DynamoDB, Cassandra, </w:t>
       </w:r>
       <w:proofErr w:type="spellStart"/>
       <w:r>
@@ -5805,7 +6488,21 @@
         <w:rPr>
           <w:rFonts w:cstheme="minorHAnsi"/>
         </w:rPr>
-        <w:t xml:space="preserve">. These shards are distributed across multiple database servers (nodes/sites) in a shared-nothing architecture. This ensures that the shards do not get bottlenecked by the compute, </w:t>
+        <w:t xml:space="preserve">. These shards are distributed across multiple database servers (nodes/sites) in a shared-nothing architecture. This ensures that the shards do not get bottlenecked by the </w:t>
+      </w:r>
+      <w:proofErr w:type="gramStart"/>
+      <w:r>
+        <w:rPr>
+          <w:rFonts w:cstheme="minorHAnsi"/>
+        </w:rPr>
+        <w:t>compute</w:t>
+      </w:r>
+      <w:proofErr w:type="gramEnd"/>
+      <w:r>
+        <w:rPr>
+          <w:rFonts w:cstheme="minorHAnsi"/>
+        </w:rPr>
+        <w:t xml:space="preserve">, </w:t>
       </w:r>
       <w:r>
         <w:rPr>
@@ -5839,7 +6536,21 @@
         <w:rPr>
           <w:rFonts w:cstheme="minorHAnsi"/>
         </w:rPr>
-        <w:t>We use a non-relational database, namely a key-value based non-relational database. We shard the data based on the key.</w:t>
+        <w:t xml:space="preserve">We use a non-relational database, namely a key-value based non-relational database. We </w:t>
+      </w:r>
+      <w:proofErr w:type="gramStart"/>
+      <w:r>
+        <w:rPr>
+          <w:rFonts w:cstheme="minorHAnsi"/>
+        </w:rPr>
+        <w:t>shard</w:t>
+      </w:r>
+      <w:proofErr w:type="gramEnd"/>
+      <w:r>
+        <w:rPr>
+          <w:rFonts w:cstheme="minorHAnsi"/>
+        </w:rPr>
+        <w:t xml:space="preserve"> the data based on the key.</w:t>
       </w:r>
     </w:p>
     <w:p>
@@ -5889,87 +6600,445 @@
         <w:rPr>
           <w:rFonts w:cstheme="minorHAnsi"/>
         </w:rPr>
+        <w:t xml:space="preserve">This sharding strategy is ideal for massively scalable workloads because it distributes data evenly across all the sites in the cluster, while retaining ease of adding sites into the cluster. With consistent hash sharding, there are many more </w:t>
+      </w:r>
+      <w:proofErr w:type="spellStart"/>
+      <w:r>
+        <w:rPr>
+          <w:rFonts w:cstheme="minorHAnsi"/>
+        </w:rPr>
+        <w:t>shards</w:t>
+      </w:r>
+      <w:proofErr w:type="spellEnd"/>
+      <w:r>
+        <w:rPr>
+          <w:rFonts w:cstheme="minorHAnsi"/>
+        </w:rPr>
+        <w:t xml:space="preserve"> than the number of sites in the cluster.</w:t>
+      </w:r>
+    </w:p>
+    <w:p>
+      <w:pPr>
+        <w:jc w:val="both"/>
+        <w:rPr>
+          <w:rFonts w:cstheme="minorHAnsi"/>
+        </w:rPr>
+      </w:pPr>
+      <w:r>
+        <w:rPr>
+          <w:rFonts w:cstheme="minorHAnsi"/>
+        </w:rPr>
+        <w:t>The assignment of shards to sites can also be done on-the-fly.</w:t>
+      </w:r>
+    </w:p>
+    <w:p>
+      <w:pPr>
+        <w:jc w:val="both"/>
+        <w:rPr>
+          <w:rFonts w:cstheme="minorHAnsi"/>
+        </w:rPr>
+      </w:pPr>
+      <w:r>
+        <w:rPr>
+          <w:rFonts w:cstheme="minorHAnsi"/>
+        </w:rPr>
+        <w:t>Cons:</w:t>
+      </w:r>
+    </w:p>
+    <w:p>
+      <w:pPr>
+        <w:jc w:val="both"/>
+        <w:rPr>
+          <w:rFonts w:cstheme="minorHAnsi"/>
+        </w:rPr>
+      </w:pPr>
+      <w:r>
+        <w:rPr>
+          <w:rFonts w:cstheme="minorHAnsi"/>
+        </w:rPr>
+        <w:t>Performing range queries could be inefficient. Examples of range queries are finding rows greater than a lower bound or less than an upper bound (as opposed to point lookups).</w:t>
+      </w:r>
+    </w:p>
+    <w:p>
+      <w:pPr>
+        <w:jc w:val="both"/>
+        <w:rPr>
+          <w:rFonts w:cstheme="minorHAnsi"/>
+        </w:rPr>
+      </w:pPr>
+      <w:r>
+        <w:rPr>
+          <w:rFonts w:cstheme="minorHAnsi"/>
+        </w:rPr>
+        <w:t xml:space="preserve">Although hashed sharding results </w:t>
+      </w:r>
+      <w:proofErr w:type="gramStart"/>
+      <w:r>
+        <w:rPr>
+          <w:rFonts w:cstheme="minorHAnsi"/>
+        </w:rPr>
+        <w:t>in even</w:t>
+      </w:r>
+      <w:proofErr w:type="gramEnd"/>
+      <w:r>
+        <w:rPr>
+          <w:rFonts w:cstheme="minorHAnsi"/>
+        </w:rPr>
+        <w:t xml:space="preserve"> data distribution among physical shards, it does not separate the database based on the meaning of the information.</w:t>
+      </w:r>
+    </w:p>
+    <w:p>
+      <w:pPr>
+        <w:jc w:val="both"/>
+        <w:rPr>
+          <w:rFonts w:cstheme="minorHAnsi"/>
+        </w:rPr>
+      </w:pPr>
+    </w:p>
+    <w:p>
+      <w:pPr>
+        <w:jc w:val="both"/>
+        <w:rPr>
+          <w:rFonts w:cstheme="minorHAnsi"/>
+        </w:rPr>
+      </w:pPr>
+    </w:p>
+    <w:p>
+      <w:pPr>
+        <w:jc w:val="both"/>
+        <w:rPr>
+          <w:rFonts w:cstheme="minorHAnsi"/>
+        </w:rPr>
+      </w:pPr>
+    </w:p>
+    <w:p>
+      <w:pPr>
+        <w:spacing w:line="360" w:lineRule="auto"/>
+        <w:jc w:val="both"/>
+        <w:rPr>
+          <w:rFonts w:cstheme="minorHAnsi"/>
+        </w:rPr>
+      </w:pPr>
+    </w:p>
+    <w:p>
+      <w:pPr>
+        <w:autoSpaceDE w:val="0"/>
+        <w:autoSpaceDN w:val="0"/>
+        <w:adjustRightInd w:val="0"/>
+        <w:spacing w:after="0" w:line="360" w:lineRule="auto"/>
+        <w:rPr>
+          <w:rFonts w:cstheme="minorHAnsi"/>
+        </w:rPr>
+      </w:pPr>
+      <w:r>
+        <w:rPr>
+          <w:rFonts w:cstheme="minorHAnsi"/>
+        </w:rPr>
+        <w:t>Alternatives to database sharding:</w:t>
+      </w:r>
+    </w:p>
+    <w:p>
+      <w:pPr>
+        <w:autoSpaceDE w:val="0"/>
+        <w:autoSpaceDN w:val="0"/>
+        <w:adjustRightInd w:val="0"/>
+        <w:spacing w:after="0" w:line="360" w:lineRule="auto"/>
+        <w:rPr>
+          <w:rFonts w:cstheme="minorHAnsi"/>
+        </w:rPr>
+      </w:pPr>
+      <w:r>
+        <w:rPr>
+          <w:rFonts w:cstheme="minorHAnsi"/>
+        </w:rPr>
+        <w:t xml:space="preserve">Vertical </w:t>
+      </w:r>
+      <w:proofErr w:type="gramStart"/>
+      <w:r>
+        <w:rPr>
+          <w:rFonts w:cstheme="minorHAnsi"/>
+        </w:rPr>
+        <w:t>scaling :</w:t>
+      </w:r>
+      <w:proofErr w:type="gramEnd"/>
+      <w:r>
+        <w:rPr>
+          <w:rFonts w:cstheme="minorHAnsi"/>
+        </w:rPr>
+        <w:t xml:space="preserve"> Vertical scaling increases the computing power of a single machine.</w:t>
+      </w:r>
+    </w:p>
+    <w:p>
+      <w:pPr>
+        <w:autoSpaceDE w:val="0"/>
+        <w:autoSpaceDN w:val="0"/>
+        <w:adjustRightInd w:val="0"/>
+        <w:spacing w:after="0" w:line="360" w:lineRule="auto"/>
+        <w:rPr>
+          <w:rFonts w:cstheme="minorHAnsi"/>
+        </w:rPr>
+      </w:pPr>
+      <w:proofErr w:type="gramStart"/>
+      <w:r>
+        <w:rPr>
+          <w:rFonts w:cstheme="minorHAnsi"/>
+        </w:rPr>
+        <w:t>Replication :</w:t>
+      </w:r>
+      <w:proofErr w:type="gramEnd"/>
+      <w:r>
+        <w:rPr>
+          <w:rFonts w:cstheme="minorHAnsi"/>
+        </w:rPr>
+        <w:t xml:space="preserve"> Replication is a technique that makes exact copies of the database and stores</w:t>
+      </w:r>
+    </w:p>
+    <w:p>
+      <w:pPr>
+        <w:autoSpaceDE w:val="0"/>
+        <w:autoSpaceDN w:val="0"/>
+        <w:adjustRightInd w:val="0"/>
+        <w:spacing w:after="0" w:line="360" w:lineRule="auto"/>
+        <w:rPr>
+          <w:rFonts w:cstheme="minorHAnsi"/>
+        </w:rPr>
+      </w:pPr>
+      <w:r>
+        <w:rPr>
+          <w:rFonts w:cstheme="minorHAnsi"/>
+        </w:rPr>
+        <w:t xml:space="preserve">them across different computers. Database designers use replication to design a </w:t>
+      </w:r>
+      <w:proofErr w:type="spellStart"/>
+      <w:proofErr w:type="gramStart"/>
+      <w:r>
+        <w:rPr>
+          <w:rFonts w:cstheme="minorHAnsi"/>
+        </w:rPr>
+        <w:t>faulttolerant</w:t>
+      </w:r>
+      <w:proofErr w:type="spellEnd"/>
+      <w:proofErr w:type="gramEnd"/>
+    </w:p>
+    <w:p>
+      <w:pPr>
+        <w:autoSpaceDE w:val="0"/>
+        <w:autoSpaceDN w:val="0"/>
+        <w:adjustRightInd w:val="0"/>
+        <w:spacing w:after="0" w:line="360" w:lineRule="auto"/>
+        <w:rPr>
+          <w:rFonts w:cstheme="minorHAnsi"/>
+        </w:rPr>
+      </w:pPr>
+      <w:r>
+        <w:rPr>
+          <w:rFonts w:cstheme="minorHAnsi"/>
+        </w:rPr>
+        <w:t>relational database management system. When one of the computers hosting the</w:t>
+      </w:r>
+    </w:p>
+    <w:p>
+      <w:pPr>
+        <w:autoSpaceDE w:val="0"/>
+        <w:autoSpaceDN w:val="0"/>
+        <w:adjustRightInd w:val="0"/>
+        <w:spacing w:after="0" w:line="360" w:lineRule="auto"/>
+        <w:rPr>
+          <w:rFonts w:cstheme="minorHAnsi"/>
+        </w:rPr>
+      </w:pPr>
+      <w:r>
+        <w:rPr>
+          <w:rFonts w:cstheme="minorHAnsi"/>
+        </w:rPr>
+        <w:t>database fails, other replicas remain operational.</w:t>
+      </w:r>
+    </w:p>
+    <w:p>
+      <w:pPr>
+        <w:autoSpaceDE w:val="0"/>
+        <w:autoSpaceDN w:val="0"/>
+        <w:adjustRightInd w:val="0"/>
+        <w:spacing w:after="0" w:line="360" w:lineRule="auto"/>
+        <w:rPr>
+          <w:rFonts w:cstheme="minorHAnsi"/>
+        </w:rPr>
+      </w:pPr>
+      <w:r>
+        <w:rPr>
+          <w:rFonts w:cstheme="minorHAnsi"/>
+        </w:rPr>
+        <w:t xml:space="preserve">Database sharding does not create copies of the same information. Instead, it splits </w:t>
+      </w:r>
+      <w:proofErr w:type="gramStart"/>
+      <w:r>
+        <w:rPr>
+          <w:rFonts w:cstheme="minorHAnsi"/>
+        </w:rPr>
+        <w:t>one</w:t>
+      </w:r>
+      <w:proofErr w:type="gramEnd"/>
+    </w:p>
+    <w:p>
+      <w:pPr>
+        <w:autoSpaceDE w:val="0"/>
+        <w:autoSpaceDN w:val="0"/>
+        <w:adjustRightInd w:val="0"/>
+        <w:spacing w:after="0" w:line="360" w:lineRule="auto"/>
+        <w:rPr>
+          <w:rFonts w:cstheme="minorHAnsi"/>
+        </w:rPr>
+      </w:pPr>
+      <w:r>
+        <w:rPr>
+          <w:rFonts w:cstheme="minorHAnsi"/>
+        </w:rPr>
+        <w:t>database into multiple parts and stores them on different computers. Unlike replication,</w:t>
+      </w:r>
+    </w:p>
+    <w:p>
+      <w:pPr>
+        <w:autoSpaceDE w:val="0"/>
+        <w:autoSpaceDN w:val="0"/>
+        <w:adjustRightInd w:val="0"/>
+        <w:spacing w:after="0" w:line="360" w:lineRule="auto"/>
+        <w:rPr>
+          <w:rFonts w:cstheme="minorHAnsi"/>
+        </w:rPr>
+      </w:pPr>
+      <w:r>
+        <w:rPr>
+          <w:rFonts w:cstheme="minorHAnsi"/>
+        </w:rPr>
+        <w:t>database sharding does not result in high availability. Sharding can be used in combination with</w:t>
+      </w:r>
+    </w:p>
+    <w:p>
+      <w:pPr>
+        <w:autoSpaceDE w:val="0"/>
+        <w:autoSpaceDN w:val="0"/>
+        <w:adjustRightInd w:val="0"/>
+        <w:spacing w:after="0" w:line="360" w:lineRule="auto"/>
+        <w:rPr>
+          <w:rFonts w:cstheme="minorHAnsi"/>
+        </w:rPr>
+      </w:pPr>
+      <w:r>
+        <w:rPr>
+          <w:rFonts w:cstheme="minorHAnsi"/>
+        </w:rPr>
+        <w:t>replication to achieve both scale and high availability.</w:t>
+      </w:r>
+    </w:p>
+    <w:p>
+      <w:pPr>
+        <w:autoSpaceDE w:val="0"/>
+        <w:autoSpaceDN w:val="0"/>
+        <w:adjustRightInd w:val="0"/>
+        <w:spacing w:after="0" w:line="360" w:lineRule="auto"/>
+        <w:rPr>
+          <w:rFonts w:cstheme="minorHAnsi"/>
+        </w:rPr>
+      </w:pPr>
+      <w:r>
+        <w:rPr>
+          <w:rFonts w:cstheme="minorHAnsi"/>
+        </w:rPr>
+        <w:t>In some cases, database sharding might consist of replications of specific datasets. For</w:t>
+      </w:r>
+    </w:p>
+    <w:p>
+      <w:pPr>
+        <w:autoSpaceDE w:val="0"/>
+        <w:autoSpaceDN w:val="0"/>
+        <w:adjustRightInd w:val="0"/>
+        <w:spacing w:after="0" w:line="360" w:lineRule="auto"/>
+        <w:rPr>
+          <w:rFonts w:cstheme="minorHAnsi"/>
+        </w:rPr>
+      </w:pPr>
+      <w:r>
+        <w:rPr>
+          <w:rFonts w:cstheme="minorHAnsi"/>
+        </w:rPr>
         <w:lastRenderedPageBreak/>
-        <w:t xml:space="preserve">This sharding strategy is ideal for massively scalable workloads because it distributes data evenly across all the sites in the cluster, while retaining ease of adding sites into the cluster. With consistent hash sharding, there are many more </w:t>
-      </w:r>
-      <w:proofErr w:type="spellStart"/>
-      <w:r>
-        <w:rPr>
-          <w:rFonts w:cstheme="minorHAnsi"/>
-        </w:rPr>
-        <w:t>shards</w:t>
-      </w:r>
-      <w:proofErr w:type="spellEnd"/>
-      <w:r>
-        <w:rPr>
-          <w:rFonts w:cstheme="minorHAnsi"/>
-        </w:rPr>
-        <w:t xml:space="preserve"> than the number of sites in the cluster.</w:t>
-      </w:r>
-    </w:p>
-    <w:p>
-      <w:pPr>
-        <w:jc w:val="both"/>
-        <w:rPr>
-          <w:rFonts w:cstheme="minorHAnsi"/>
-        </w:rPr>
-      </w:pPr>
-      <w:r>
-        <w:rPr>
-          <w:rFonts w:cstheme="minorHAnsi"/>
-        </w:rPr>
-        <w:t>The assignment of shards to sites can also be done on-the-fly.</w:t>
-      </w:r>
-    </w:p>
-    <w:p>
-      <w:pPr>
-        <w:jc w:val="both"/>
-        <w:rPr>
-          <w:rFonts w:cstheme="minorHAnsi"/>
-        </w:rPr>
-      </w:pPr>
-      <w:r>
-        <w:rPr>
-          <w:rFonts w:cstheme="minorHAnsi"/>
-        </w:rPr>
-        <w:t>Cons:</w:t>
-      </w:r>
-    </w:p>
-    <w:p>
-      <w:pPr>
-        <w:jc w:val="both"/>
-        <w:rPr>
-          <w:rFonts w:cstheme="minorHAnsi"/>
-        </w:rPr>
-      </w:pPr>
-      <w:r>
-        <w:rPr>
-          <w:rFonts w:cstheme="minorHAnsi"/>
-        </w:rPr>
-        <w:t>Performing range queries could be inefficient. Examples of range queries are finding rows greater than a lower bound or less than an upper bound (as opposed to point lookups).</w:t>
-      </w:r>
-    </w:p>
-    <w:p>
-      <w:pPr>
-        <w:jc w:val="both"/>
-        <w:rPr>
-          <w:rFonts w:cstheme="minorHAnsi"/>
-        </w:rPr>
-      </w:pPr>
-      <w:r>
-        <w:rPr>
-          <w:rFonts w:cstheme="minorHAnsi"/>
-        </w:rPr>
-        <w:t>Although hashed sharding results in even data distribution among physical shards, it does not separate the database based on the meaning of the information.</w:t>
-      </w:r>
-    </w:p>
-    <w:p>
-      <w:pPr>
-        <w:jc w:val="both"/>
-        <w:rPr>
-          <w:rFonts w:cstheme="minorHAnsi"/>
-        </w:rPr>
-      </w:pPr>
+        <w:t xml:space="preserve">example, a retail store that sells products to both US and European customers might </w:t>
+      </w:r>
+      <w:proofErr w:type="gramStart"/>
+      <w:r>
+        <w:rPr>
+          <w:rFonts w:cstheme="minorHAnsi"/>
+        </w:rPr>
+        <w:t>store</w:t>
+      </w:r>
+      <w:proofErr w:type="gramEnd"/>
+    </w:p>
+    <w:p>
+      <w:pPr>
+        <w:autoSpaceDE w:val="0"/>
+        <w:autoSpaceDN w:val="0"/>
+        <w:adjustRightInd w:val="0"/>
+        <w:spacing w:after="0" w:line="360" w:lineRule="auto"/>
+        <w:rPr>
+          <w:rFonts w:cstheme="minorHAnsi"/>
+        </w:rPr>
+      </w:pPr>
+      <w:r>
+        <w:rPr>
+          <w:rFonts w:cstheme="minorHAnsi"/>
+        </w:rPr>
+        <w:t xml:space="preserve">replicas of size conversion tables on different shards for both regions. The application can </w:t>
+      </w:r>
+      <w:proofErr w:type="gramStart"/>
+      <w:r>
+        <w:rPr>
+          <w:rFonts w:cstheme="minorHAnsi"/>
+        </w:rPr>
+        <w:t>use</w:t>
+      </w:r>
+      <w:proofErr w:type="gramEnd"/>
+    </w:p>
+    <w:p>
+      <w:pPr>
+        <w:autoSpaceDE w:val="0"/>
+        <w:autoSpaceDN w:val="0"/>
+        <w:adjustRightInd w:val="0"/>
+        <w:spacing w:after="0" w:line="360" w:lineRule="auto"/>
+        <w:rPr>
+          <w:rFonts w:cstheme="minorHAnsi"/>
+        </w:rPr>
+      </w:pPr>
+      <w:r>
+        <w:rPr>
+          <w:rFonts w:cstheme="minorHAnsi"/>
+        </w:rPr>
+        <w:t xml:space="preserve">the duplicate copies of the conversion table to convert the measurement size without </w:t>
+      </w:r>
+      <w:proofErr w:type="gramStart"/>
+      <w:r>
+        <w:rPr>
+          <w:rFonts w:cstheme="minorHAnsi"/>
+        </w:rPr>
+        <w:t>accessing</w:t>
+      </w:r>
+      <w:proofErr w:type="gramEnd"/>
+    </w:p>
+    <w:p>
+      <w:pPr>
+        <w:autoSpaceDE w:val="0"/>
+        <w:autoSpaceDN w:val="0"/>
+        <w:adjustRightInd w:val="0"/>
+        <w:spacing w:after="0" w:line="360" w:lineRule="auto"/>
+        <w:rPr>
+          <w:rFonts w:cstheme="minorHAnsi"/>
+        </w:rPr>
+      </w:pPr>
+      <w:r>
+        <w:rPr>
+          <w:rFonts w:cstheme="minorHAnsi"/>
+        </w:rPr>
+        <w:t>other database servers.</w:t>
+      </w:r>
     </w:p>
     <w:p>
       <w:pPr>
@@ -5990,7 +7059,7 @@
 </file>
 
 <file path=word/comments.xml><?xml version="1.0" encoding="utf-8"?>
-<w:comments xmlns:wpc="http://schemas.microsoft.com/office/word/2010/wordprocessingCanvas" xmlns:cx="http://schemas.microsoft.com/office/drawing/2014/chartex" xmlns:cx1="http://schemas.microsoft.com/office/drawing/2015/9/8/chartex" xmlns:cx2="http://schemas.microsoft.com/office/drawing/2015/10/21/chartex" xmlns:cx3="http://schemas.microsoft.com/office/drawing/2016/5/9/chartex" xmlns:cx4="http://schemas.microsoft.com/office/drawing/2016/5/10/chartex" xmlns:cx5="http://schemas.microsoft.com/office/drawing/2016/5/11/chartex" xmlns:cx6="http://schemas.microsoft.com/office/drawing/2016/5/12/chartex" xmlns:cx7="http://schemas.microsoft.com/office/drawing/2016/5/13/chartex" xmlns:cx8="http://schemas.microsoft.com/office/drawing/2016/5/14/chartex" xmlns:mc="http://schemas.openxmlformats.org/markup-compatibility/2006" xmlns:aink="http://schemas.microsoft.com/office/drawing/2016/ink" xmlns:am3d="http://schemas.microsoft.com/office/drawing/2017/model3d" xmlns:o="urn:schemas-microsoft-com:office:office" xmlns:oel="http://schemas.microsoft.com/office/2019/extlst" xmlns:r="http://schemas.openxmlformats.org/officeDocument/2006/relationships" xmlns:m="http://schemas.openxmlformats.org/officeDocument/2006/math" xmlns:v="urn:schemas-microsoft-com:vml" xmlns:wp14="http://schemas.microsoft.com/office/word/2010/wordprocessingDrawing" xmlns:wp="http://schemas.openxmlformats.org/drawingml/2006/wordprocessingDrawing" xmlns:w10="urn:schemas-microsoft-com:office:word" xmlns:w="http://schemas.openxmlformats.org/wordprocessingml/2006/main" xmlns:w14="http://schemas.microsoft.com/office/word/2010/wordml" xmlns:w15="http://schemas.microsoft.com/office/word/2012/wordml" xmlns:w16cex="http://schemas.microsoft.com/office/word/2018/wordml/cex" xmlns:w16cid="http://schemas.microsoft.com/office/word/2016/wordml/cid" xmlns:w16="http://schemas.microsoft.com/office/word/2018/wordml" xmlns:w16sdtdh="http://schemas.microsoft.com/office/word/2020/wordml/sdtdatahash" xmlns:w16se="http://schemas.microsoft.com/office/word/2015/wordml/symex" xmlns:wpg="http://schemas.microsoft.com/office/word/2010/wordprocessingGroup" xmlns:wpi="http://schemas.microsoft.com/office/word/2010/wordprocessingInk" xmlns:wne="http://schemas.microsoft.com/office/word/2006/wordml" xmlns:wps="http://schemas.microsoft.com/office/word/2010/wordprocessingShape" mc:Ignorable="w14 w15 w16se w16cid w16 w16cex w16sdtdh wp14">
+<w:comments xmlns:wpc="http://schemas.microsoft.com/office/word/2010/wordprocessingCanvas" xmlns:cx="http://schemas.microsoft.com/office/drawing/2014/chartex" xmlns:cx1="http://schemas.microsoft.com/office/drawing/2015/9/8/chartex" xmlns:cx2="http://schemas.microsoft.com/office/drawing/2015/10/21/chartex" xmlns:cx3="http://schemas.microsoft.com/office/drawing/2016/5/9/chartex" xmlns:cx4="http://schemas.microsoft.com/office/drawing/2016/5/10/chartex" xmlns:cx5="http://schemas.microsoft.com/office/drawing/2016/5/11/chartex" xmlns:cx6="http://schemas.microsoft.com/office/drawing/2016/5/12/chartex" xmlns:cx7="http://schemas.microsoft.com/office/drawing/2016/5/13/chartex" xmlns:cx8="http://schemas.microsoft.com/office/drawing/2016/5/14/chartex" xmlns:mc="http://schemas.openxmlformats.org/markup-compatibility/2006" xmlns:aink="http://schemas.microsoft.com/office/drawing/2016/ink" xmlns:am3d="http://schemas.microsoft.com/office/drawing/2017/model3d" xmlns:o="urn:schemas-microsoft-com:office:office" xmlns:oel="http://schemas.microsoft.com/office/2019/extlst" xmlns:r="http://schemas.openxmlformats.org/officeDocument/2006/relationships" xmlns:m="http://schemas.openxmlformats.org/officeDocument/2006/math" xmlns:v="urn:schemas-microsoft-com:vml" xmlns:wp14="http://schemas.microsoft.com/office/word/2010/wordprocessingDrawing" xmlns:wp="http://schemas.openxmlformats.org/drawingml/2006/wordprocessingDrawing" xmlns:w10="urn:schemas-microsoft-com:office:word" xmlns:w="http://schemas.openxmlformats.org/wordprocessingml/2006/main" xmlns:w14="http://schemas.microsoft.com/office/word/2010/wordml" xmlns:w15="http://schemas.microsoft.com/office/word/2012/wordml" xmlns:w16cex="http://schemas.microsoft.com/office/word/2018/wordml/cex" xmlns:w16cid="http://schemas.microsoft.com/office/word/2016/wordml/cid" xmlns:w16="http://schemas.microsoft.com/office/word/2018/wordml" xmlns:w16du="http://schemas.microsoft.com/office/word/2023/wordml/word16du" xmlns:w16sdtdh="http://schemas.microsoft.com/office/word/2020/wordml/sdtdatahash" xmlns:w16se="http://schemas.microsoft.com/office/word/2015/wordml/symex" xmlns:wpg="http://schemas.microsoft.com/office/word/2010/wordprocessingGroup" xmlns:wpi="http://schemas.microsoft.com/office/word/2010/wordprocessingInk" xmlns:wne="http://schemas.microsoft.com/office/word/2006/wordml" xmlns:wps="http://schemas.microsoft.com/office/word/2010/wordprocessingShape" mc:Ignorable="w14 w15 w16se w16cid w16 w16cex w16sdtdh wp14">
   <w:comment w:id="0" w:author="Ritesh Shrestha" w:date="2023-03-15T07:38:00Z" w:initials="RS">
     <w:p>
       <w:pPr>
@@ -6016,6 +7085,38 @@
       <w:r>
         <w:br/>
         <w:t xml:space="preserve">THIRD EDITION </w:t>
+      </w:r>
+    </w:p>
+  </w:comment>
+  <w:comment w:id="1" w:author="Ritesh Shrestha" w:date="2023-04-22T09:18:00Z" w:initials="RS">
+    <w:p>
+      <w:pPr>
+        <w:pStyle w:val="CommentText"/>
+      </w:pPr>
+      <w:r>
+        <w:rPr>
+          <w:rStyle w:val="CommentReference"/>
+        </w:rPr>
+        <w:annotationRef/>
+      </w:r>
+      <w:r>
+        <w:t xml:space="preserve">@book{coronel2016database, title={Database systems: design, implementation, \&amp; management}, author={Coronel, Carlos and Morris, Steven}, year={2016}, publisher={Cengage Learning} } </w:t>
+      </w:r>
+    </w:p>
+  </w:comment>
+  <w:comment w:id="2" w:author="Ritesh Shrestha" w:date="2023-04-22T13:19:00Z" w:initials="RS">
+    <w:p>
+      <w:pPr>
+        <w:pStyle w:val="CommentText"/>
+      </w:pPr>
+      <w:r>
+        <w:rPr>
+          <w:rStyle w:val="CommentReference"/>
+        </w:rPr>
+        <w:annotationRef/>
+      </w:r>
+      <w:r>
+        <w:t xml:space="preserve"> @book{ozsu1999principles, title={Principles of distributed database systems}, author={{\"O}zsu, M Tamer and Valduriez, Patrick and others}, volume={2}, publisher={Springer} } </w:t>
       </w:r>
     </w:p>
   </w:comment>
@@ -6023,25 +7124,31 @@
 </file>
 
 <file path=word/commentsExtended.xml><?xml version="1.0" encoding="utf-8"?>
-<w15:commentsEx xmlns:wpc="http://schemas.microsoft.com/office/word/2010/wordprocessingCanvas" xmlns:cx="http://schemas.microsoft.com/office/drawing/2014/chartex" xmlns:cx1="http://schemas.microsoft.com/office/drawing/2015/9/8/chartex" xmlns:cx2="http://schemas.microsoft.com/office/drawing/2015/10/21/chartex" xmlns:cx3="http://schemas.microsoft.com/office/drawing/2016/5/9/chartex" xmlns:cx4="http://schemas.microsoft.com/office/drawing/2016/5/10/chartex" xmlns:cx5="http://schemas.microsoft.com/office/drawing/2016/5/11/chartex" xmlns:cx6="http://schemas.microsoft.com/office/drawing/2016/5/12/chartex" xmlns:cx7="http://schemas.microsoft.com/office/drawing/2016/5/13/chartex" xmlns:cx8="http://schemas.microsoft.com/office/drawing/2016/5/14/chartex" xmlns:mc="http://schemas.openxmlformats.org/markup-compatibility/2006" xmlns:aink="http://schemas.microsoft.com/office/drawing/2016/ink" xmlns:am3d="http://schemas.microsoft.com/office/drawing/2017/model3d" xmlns:o="urn:schemas-microsoft-com:office:office" xmlns:oel="http://schemas.microsoft.com/office/2019/extlst" xmlns:r="http://schemas.openxmlformats.org/officeDocument/2006/relationships" xmlns:m="http://schemas.openxmlformats.org/officeDocument/2006/math" xmlns:v="urn:schemas-microsoft-com:vml" xmlns:wp14="http://schemas.microsoft.com/office/word/2010/wordprocessingDrawing" xmlns:wp="http://schemas.openxmlformats.org/drawingml/2006/wordprocessingDrawing" xmlns:w10="urn:schemas-microsoft-com:office:word" xmlns:w="http://schemas.openxmlformats.org/wordprocessingml/2006/main" xmlns:w14="http://schemas.microsoft.com/office/word/2010/wordml" xmlns:w15="http://schemas.microsoft.com/office/word/2012/wordml" xmlns:w16cex="http://schemas.microsoft.com/office/word/2018/wordml/cex" xmlns:w16cid="http://schemas.microsoft.com/office/word/2016/wordml/cid" xmlns:w16="http://schemas.microsoft.com/office/word/2018/wordml" xmlns:w16sdtdh="http://schemas.microsoft.com/office/word/2020/wordml/sdtdatahash" xmlns:w16se="http://schemas.microsoft.com/office/word/2015/wordml/symex" xmlns:wpg="http://schemas.microsoft.com/office/word/2010/wordprocessingGroup" xmlns:wpi="http://schemas.microsoft.com/office/word/2010/wordprocessingInk" xmlns:wne="http://schemas.microsoft.com/office/word/2006/wordml" xmlns:wps="http://schemas.microsoft.com/office/word/2010/wordprocessingShape" mc:Ignorable="w14 w15 w16se w16cid w16 w16cex w16sdtdh wp14">
+<w15:commentsEx xmlns:wpc="http://schemas.microsoft.com/office/word/2010/wordprocessingCanvas" xmlns:cx="http://schemas.microsoft.com/office/drawing/2014/chartex" xmlns:cx1="http://schemas.microsoft.com/office/drawing/2015/9/8/chartex" xmlns:cx2="http://schemas.microsoft.com/office/drawing/2015/10/21/chartex" xmlns:cx3="http://schemas.microsoft.com/office/drawing/2016/5/9/chartex" xmlns:cx4="http://schemas.microsoft.com/office/drawing/2016/5/10/chartex" xmlns:cx5="http://schemas.microsoft.com/office/drawing/2016/5/11/chartex" xmlns:cx6="http://schemas.microsoft.com/office/drawing/2016/5/12/chartex" xmlns:cx7="http://schemas.microsoft.com/office/drawing/2016/5/13/chartex" xmlns:cx8="http://schemas.microsoft.com/office/drawing/2016/5/14/chartex" xmlns:mc="http://schemas.openxmlformats.org/markup-compatibility/2006" xmlns:aink="http://schemas.microsoft.com/office/drawing/2016/ink" xmlns:am3d="http://schemas.microsoft.com/office/drawing/2017/model3d" xmlns:o="urn:schemas-microsoft-com:office:office" xmlns:oel="http://schemas.microsoft.com/office/2019/extlst" xmlns:r="http://schemas.openxmlformats.org/officeDocument/2006/relationships" xmlns:m="http://schemas.openxmlformats.org/officeDocument/2006/math" xmlns:v="urn:schemas-microsoft-com:vml" xmlns:wp14="http://schemas.microsoft.com/office/word/2010/wordprocessingDrawing" xmlns:wp="http://schemas.openxmlformats.org/drawingml/2006/wordprocessingDrawing" xmlns:w10="urn:schemas-microsoft-com:office:word" xmlns:w="http://schemas.openxmlformats.org/wordprocessingml/2006/main" xmlns:w14="http://schemas.microsoft.com/office/word/2010/wordml" xmlns:w15="http://schemas.microsoft.com/office/word/2012/wordml" xmlns:w16cex="http://schemas.microsoft.com/office/word/2018/wordml/cex" xmlns:w16cid="http://schemas.microsoft.com/office/word/2016/wordml/cid" xmlns:w16="http://schemas.microsoft.com/office/word/2018/wordml" xmlns:w16du="http://schemas.microsoft.com/office/word/2023/wordml/word16du" xmlns:w16sdtdh="http://schemas.microsoft.com/office/word/2020/wordml/sdtdatahash" xmlns:w16se="http://schemas.microsoft.com/office/word/2015/wordml/symex" xmlns:wpg="http://schemas.microsoft.com/office/word/2010/wordprocessingGroup" xmlns:wpi="http://schemas.microsoft.com/office/word/2010/wordprocessingInk" xmlns:wne="http://schemas.microsoft.com/office/word/2006/wordml" xmlns:wps="http://schemas.microsoft.com/office/word/2010/wordprocessingShape" mc:Ignorable="w14 w15 w16se w16cid w16 w16cex w16sdtdh wp14">
   <w15:commentEx w15:paraId="78E3ADCD" w15:done="0"/>
+  <w15:commentEx w15:paraId="6FEC1F36" w15:done="0"/>
+  <w15:commentEx w15:paraId="507656C6" w15:done="0"/>
 </w15:commentsEx>
 </file>
 
 <file path=word/commentsExtensible.xml><?xml version="1.0" encoding="utf-8"?>
-<w16cex:commentsExtensible xmlns:wpc="http://schemas.microsoft.com/office/word/2010/wordprocessingCanvas" xmlns:cx="http://schemas.microsoft.com/office/drawing/2014/chartex" xmlns:cx1="http://schemas.microsoft.com/office/drawing/2015/9/8/chartex" xmlns:cx2="http://schemas.microsoft.com/office/drawing/2015/10/21/chartex" xmlns:cx3="http://schemas.microsoft.com/office/drawing/2016/5/9/chartex" xmlns:cx4="http://schemas.microsoft.com/office/drawing/2016/5/10/chartex" xmlns:cx5="http://schemas.microsoft.com/office/drawing/2016/5/11/chartex" xmlns:cx6="http://schemas.microsoft.com/office/drawing/2016/5/12/chartex" xmlns:cx7="http://schemas.microsoft.com/office/drawing/2016/5/13/chartex" xmlns:cx8="http://schemas.microsoft.com/office/drawing/2016/5/14/chartex" xmlns:mc="http://schemas.openxmlformats.org/markup-compatibility/2006" xmlns:aink="http://schemas.microsoft.com/office/drawing/2016/ink" xmlns:am3d="http://schemas.microsoft.com/office/drawing/2017/model3d" xmlns:o="urn:schemas-microsoft-com:office:office" xmlns:oel="http://schemas.microsoft.com/office/2019/extlst" xmlns:r="http://schemas.openxmlformats.org/officeDocument/2006/relationships" xmlns:m="http://schemas.openxmlformats.org/officeDocument/2006/math" xmlns:v="urn:schemas-microsoft-com:vml" xmlns:wp14="http://schemas.microsoft.com/office/word/2010/wordprocessingDrawing" xmlns:wp="http://schemas.openxmlformats.org/drawingml/2006/wordprocessingDrawing" xmlns:w10="urn:schemas-microsoft-com:office:word" xmlns:w="http://schemas.openxmlformats.org/wordprocessingml/2006/main" xmlns:w14="http://schemas.microsoft.com/office/word/2010/wordml" xmlns:w15="http://schemas.microsoft.com/office/word/2012/wordml" xmlns:w16cex="http://schemas.microsoft.com/office/word/2018/wordml/cex" xmlns:w16cid="http://schemas.microsoft.com/office/word/2016/wordml/cid" xmlns:w16="http://schemas.microsoft.com/office/word/2018/wordml" xmlns:w16sdtdh="http://schemas.microsoft.com/office/word/2020/wordml/sdtdatahash" xmlns:w16se="http://schemas.microsoft.com/office/word/2015/wordml/symex" xmlns:wpg="http://schemas.microsoft.com/office/word/2010/wordprocessingGroup" xmlns:wpi="http://schemas.microsoft.com/office/word/2010/wordprocessingInk" xmlns:wne="http://schemas.microsoft.com/office/word/2006/wordml" xmlns:wps="http://schemas.microsoft.com/office/word/2010/wordprocessingShape" mc:Ignorable="w14 w15 w16se w16cid w16 w16cex w16sdtdh wp14">
+<w16cex:commentsExtensible xmlns:wpc="http://schemas.microsoft.com/office/word/2010/wordprocessingCanvas" xmlns:cx="http://schemas.microsoft.com/office/drawing/2014/chartex" xmlns:cx1="http://schemas.microsoft.com/office/drawing/2015/9/8/chartex" xmlns:cx2="http://schemas.microsoft.com/office/drawing/2015/10/21/chartex" xmlns:cx3="http://schemas.microsoft.com/office/drawing/2016/5/9/chartex" xmlns:cx4="http://schemas.microsoft.com/office/drawing/2016/5/10/chartex" xmlns:cx5="http://schemas.microsoft.com/office/drawing/2016/5/11/chartex" xmlns:cx6="http://schemas.microsoft.com/office/drawing/2016/5/12/chartex" xmlns:cx7="http://schemas.microsoft.com/office/drawing/2016/5/13/chartex" xmlns:cx8="http://schemas.microsoft.com/office/drawing/2016/5/14/chartex" xmlns:mc="http://schemas.openxmlformats.org/markup-compatibility/2006" xmlns:aink="http://schemas.microsoft.com/office/drawing/2016/ink" xmlns:am3d="http://schemas.microsoft.com/office/drawing/2017/model3d" xmlns:o="urn:schemas-microsoft-com:office:office" xmlns:oel="http://schemas.microsoft.com/office/2019/extlst" xmlns:r="http://schemas.openxmlformats.org/officeDocument/2006/relationships" xmlns:m="http://schemas.openxmlformats.org/officeDocument/2006/math" xmlns:v="urn:schemas-microsoft-com:vml" xmlns:wp14="http://schemas.microsoft.com/office/word/2010/wordprocessingDrawing" xmlns:wp="http://schemas.openxmlformats.org/drawingml/2006/wordprocessingDrawing" xmlns:w10="urn:schemas-microsoft-com:office:word" xmlns:w="http://schemas.openxmlformats.org/wordprocessingml/2006/main" xmlns:w14="http://schemas.microsoft.com/office/word/2010/wordml" xmlns:w15="http://schemas.microsoft.com/office/word/2012/wordml" xmlns:w16cex="http://schemas.microsoft.com/office/word/2018/wordml/cex" xmlns:w16cid="http://schemas.microsoft.com/office/word/2016/wordml/cid" xmlns:w16="http://schemas.microsoft.com/office/word/2018/wordml" xmlns:w16du="http://schemas.microsoft.com/office/word/2023/wordml/word16du" xmlns:w16sdtdh="http://schemas.microsoft.com/office/word/2020/wordml/sdtdatahash" xmlns:w16se="http://schemas.microsoft.com/office/word/2015/wordml/symex" xmlns:wpg="http://schemas.microsoft.com/office/word/2010/wordprocessingGroup" xmlns:wpi="http://schemas.microsoft.com/office/word/2010/wordprocessingInk" xmlns:wne="http://schemas.microsoft.com/office/word/2006/wordml" xmlns:wps="http://schemas.microsoft.com/office/word/2010/wordprocessingShape" mc:Ignorable="w14 w15 w16se w16cid w16 w16cex w16sdtdh wp14">
   <w16cex:commentExtensible w16cex:durableId="27BBF469" w16cex:dateUtc="2023-03-15T06:38:00Z"/>
+  <w16cex:commentExtensible w16cex:durableId="27EE24D8" w16cex:dateUtc="2023-04-22T07:18:00Z"/>
+  <w16cex:commentExtensible w16cex:durableId="27EE5D76" w16cex:dateUtc="2023-04-22T11:19:00Z"/>
 </w16cex:commentsExtensible>
 </file>
 
 <file path=word/commentsIds.xml><?xml version="1.0" encoding="utf-8"?>
-<w16cid:commentsIds xmlns:wpc="http://schemas.microsoft.com/office/word/2010/wordprocessingCanvas" xmlns:cx="http://schemas.microsoft.com/office/drawing/2014/chartex" xmlns:cx1="http://schemas.microsoft.com/office/drawing/2015/9/8/chartex" xmlns:cx2="http://schemas.microsoft.com/office/drawing/2015/10/21/chartex" xmlns:cx3="http://schemas.microsoft.com/office/drawing/2016/5/9/chartex" xmlns:cx4="http://schemas.microsoft.com/office/drawing/2016/5/10/chartex" xmlns:cx5="http://schemas.microsoft.com/office/drawing/2016/5/11/chartex" xmlns:cx6="http://schemas.microsoft.com/office/drawing/2016/5/12/chartex" xmlns:cx7="http://schemas.microsoft.com/office/drawing/2016/5/13/chartex" xmlns:cx8="http://schemas.microsoft.com/office/drawing/2016/5/14/chartex" xmlns:mc="http://schemas.openxmlformats.org/markup-compatibility/2006" xmlns:aink="http://schemas.microsoft.com/office/drawing/2016/ink" xmlns:am3d="http://schemas.microsoft.com/office/drawing/2017/model3d" xmlns:o="urn:schemas-microsoft-com:office:office" xmlns:oel="http://schemas.microsoft.com/office/2019/extlst" xmlns:r="http://schemas.openxmlformats.org/officeDocument/2006/relationships" xmlns:m="http://schemas.openxmlformats.org/officeDocument/2006/math" xmlns:v="urn:schemas-microsoft-com:vml" xmlns:wp14="http://schemas.microsoft.com/office/word/2010/wordprocessingDrawing" xmlns:wp="http://schemas.openxmlformats.org/drawingml/2006/wordprocessingDrawing" xmlns:w10="urn:schemas-microsoft-com:office:word" xmlns:w="http://schemas.openxmlformats.org/wordprocessingml/2006/main" xmlns:w14="http://schemas.microsoft.com/office/word/2010/wordml" xmlns:w15="http://schemas.microsoft.com/office/word/2012/wordml" xmlns:w16cex="http://schemas.microsoft.com/office/word/2018/wordml/cex" xmlns:w16cid="http://schemas.microsoft.com/office/word/2016/wordml/cid" xmlns:w16="http://schemas.microsoft.com/office/word/2018/wordml" xmlns:w16sdtdh="http://schemas.microsoft.com/office/word/2020/wordml/sdtdatahash" xmlns:w16se="http://schemas.microsoft.com/office/word/2015/wordml/symex" xmlns:wpg="http://schemas.microsoft.com/office/word/2010/wordprocessingGroup" xmlns:wpi="http://schemas.microsoft.com/office/word/2010/wordprocessingInk" xmlns:wne="http://schemas.microsoft.com/office/word/2006/wordml" xmlns:wps="http://schemas.microsoft.com/office/word/2010/wordprocessingShape" mc:Ignorable="w14 w15 w16se w16cid w16 w16cex w16sdtdh wp14">
+<w16cid:commentsIds xmlns:wpc="http://schemas.microsoft.com/office/word/2010/wordprocessingCanvas" xmlns:cx="http://schemas.microsoft.com/office/drawing/2014/chartex" xmlns:cx1="http://schemas.microsoft.com/office/drawing/2015/9/8/chartex" xmlns:cx2="http://schemas.microsoft.com/office/drawing/2015/10/21/chartex" xmlns:cx3="http://schemas.microsoft.com/office/drawing/2016/5/9/chartex" xmlns:cx4="http://schemas.microsoft.com/office/drawing/2016/5/10/chartex" xmlns:cx5="http://schemas.microsoft.com/office/drawing/2016/5/11/chartex" xmlns:cx6="http://schemas.microsoft.com/office/drawing/2016/5/12/chartex" xmlns:cx7="http://schemas.microsoft.com/office/drawing/2016/5/13/chartex" xmlns:cx8="http://schemas.microsoft.com/office/drawing/2016/5/14/chartex" xmlns:mc="http://schemas.openxmlformats.org/markup-compatibility/2006" xmlns:aink="http://schemas.microsoft.com/office/drawing/2016/ink" xmlns:am3d="http://schemas.microsoft.com/office/drawing/2017/model3d" xmlns:o="urn:schemas-microsoft-com:office:office" xmlns:oel="http://schemas.microsoft.com/office/2019/extlst" xmlns:r="http://schemas.openxmlformats.org/officeDocument/2006/relationships" xmlns:m="http://schemas.openxmlformats.org/officeDocument/2006/math" xmlns:v="urn:schemas-microsoft-com:vml" xmlns:wp14="http://schemas.microsoft.com/office/word/2010/wordprocessingDrawing" xmlns:wp="http://schemas.openxmlformats.org/drawingml/2006/wordprocessingDrawing" xmlns:w10="urn:schemas-microsoft-com:office:word" xmlns:w="http://schemas.openxmlformats.org/wordprocessingml/2006/main" xmlns:w14="http://schemas.microsoft.com/office/word/2010/wordml" xmlns:w15="http://schemas.microsoft.com/office/word/2012/wordml" xmlns:w16cex="http://schemas.microsoft.com/office/word/2018/wordml/cex" xmlns:w16cid="http://schemas.microsoft.com/office/word/2016/wordml/cid" xmlns:w16="http://schemas.microsoft.com/office/word/2018/wordml" xmlns:w16du="http://schemas.microsoft.com/office/word/2023/wordml/word16du" xmlns:w16sdtdh="http://schemas.microsoft.com/office/word/2020/wordml/sdtdatahash" xmlns:w16se="http://schemas.microsoft.com/office/word/2015/wordml/symex" xmlns:wpg="http://schemas.microsoft.com/office/word/2010/wordprocessingGroup" xmlns:wpi="http://schemas.microsoft.com/office/word/2010/wordprocessingInk" xmlns:wne="http://schemas.microsoft.com/office/word/2006/wordml" xmlns:wps="http://schemas.microsoft.com/office/word/2010/wordprocessingShape" mc:Ignorable="w14 w15 w16se w16cid w16 w16cex w16sdtdh wp14">
   <w16cid:commentId w16cid:paraId="78E3ADCD" w16cid:durableId="27BBF469"/>
+  <w16cid:commentId w16cid:paraId="6FEC1F36" w16cid:durableId="27EE24D8"/>
+  <w16cid:commentId w16cid:paraId="507656C6" w16cid:durableId="27EE5D76"/>
 </w16cid:commentsIds>
 </file>
 
 <file path=word/numbering.xml><?xml version="1.0" encoding="utf-8"?>
-<w:numbering xmlns:wpc="http://schemas.microsoft.com/office/word/2010/wordprocessingCanvas" xmlns:cx="http://schemas.microsoft.com/office/drawing/2014/chartex" xmlns:cx1="http://schemas.microsoft.com/office/drawing/2015/9/8/chartex" xmlns:cx2="http://schemas.microsoft.com/office/drawing/2015/10/21/chartex" xmlns:cx3="http://schemas.microsoft.com/office/drawing/2016/5/9/chartex" xmlns:cx4="http://schemas.microsoft.com/office/drawing/2016/5/10/chartex" xmlns:cx5="http://schemas.microsoft.com/office/drawing/2016/5/11/chartex" xmlns:cx6="http://schemas.microsoft.com/office/drawing/2016/5/12/chartex" xmlns:cx7="http://schemas.microsoft.com/office/drawing/2016/5/13/chartex" xmlns:cx8="http://schemas.microsoft.com/office/drawing/2016/5/14/chartex" xmlns:mc="http://schemas.openxmlformats.org/markup-compatibility/2006" xmlns:aink="http://schemas.microsoft.com/office/drawing/2016/ink" xmlns:am3d="http://schemas.microsoft.com/office/drawing/2017/model3d" xmlns:o="urn:schemas-microsoft-com:office:office" xmlns:oel="http://schemas.microsoft.com/office/2019/extlst" xmlns:r="http://schemas.openxmlformats.org/officeDocument/2006/relationships" xmlns:m="http://schemas.openxmlformats.org/officeDocument/2006/math" xmlns:v="urn:schemas-microsoft-com:vml" xmlns:wp14="http://schemas.microsoft.com/office/word/2010/wordprocessingDrawing" xmlns:wp="http://schemas.openxmlformats.org/drawingml/2006/wordprocessingDrawing" xmlns:w10="urn:schemas-microsoft-com:office:word" xmlns:w="http://schemas.openxmlformats.org/wordprocessingml/2006/main" xmlns:w14="http://schemas.microsoft.com/office/word/2010/wordml" xmlns:w15="http://schemas.microsoft.com/office/word/2012/wordml" xmlns:w16cex="http://schemas.microsoft.com/office/word/2018/wordml/cex" xmlns:w16cid="http://schemas.microsoft.com/office/word/2016/wordml/cid" xmlns:w16="http://schemas.microsoft.com/office/word/2018/wordml" xmlns:w16sdtdh="http://schemas.microsoft.com/office/word/2020/wordml/sdtdatahash" xmlns:w16se="http://schemas.microsoft.com/office/word/2015/wordml/symex" xmlns:wpg="http://schemas.microsoft.com/office/word/2010/wordprocessingGroup" xmlns:wpi="http://schemas.microsoft.com/office/word/2010/wordprocessingInk" xmlns:wne="http://schemas.microsoft.com/office/word/2006/wordml" xmlns:wps="http://schemas.microsoft.com/office/word/2010/wordprocessingShape" mc:Ignorable="w14 w15 w16se w16cid w16 w16cex w16sdtdh wp14">
+<w:numbering xmlns:wpc="http://schemas.microsoft.com/office/word/2010/wordprocessingCanvas" xmlns:cx="http://schemas.microsoft.com/office/drawing/2014/chartex" xmlns:cx1="http://schemas.microsoft.com/office/drawing/2015/9/8/chartex" xmlns:cx2="http://schemas.microsoft.com/office/drawing/2015/10/21/chartex" xmlns:cx3="http://schemas.microsoft.com/office/drawing/2016/5/9/chartex" xmlns:cx4="http://schemas.microsoft.com/office/drawing/2016/5/10/chartex" xmlns:cx5="http://schemas.microsoft.com/office/drawing/2016/5/11/chartex" xmlns:cx6="http://schemas.microsoft.com/office/drawing/2016/5/12/chartex" xmlns:cx7="http://schemas.microsoft.com/office/drawing/2016/5/13/chartex" xmlns:cx8="http://schemas.microsoft.com/office/drawing/2016/5/14/chartex" xmlns:mc="http://schemas.openxmlformats.org/markup-compatibility/2006" xmlns:aink="http://schemas.microsoft.com/office/drawing/2016/ink" xmlns:am3d="http://schemas.microsoft.com/office/drawing/2017/model3d" xmlns:o="urn:schemas-microsoft-com:office:office" xmlns:oel="http://schemas.microsoft.com/office/2019/extlst" xmlns:r="http://schemas.openxmlformats.org/officeDocument/2006/relationships" xmlns:m="http://schemas.openxmlformats.org/officeDocument/2006/math" xmlns:v="urn:schemas-microsoft-com:vml" xmlns:wp14="http://schemas.microsoft.com/office/word/2010/wordprocessingDrawing" xmlns:wp="http://schemas.openxmlformats.org/drawingml/2006/wordprocessingDrawing" xmlns:w10="urn:schemas-microsoft-com:office:word" xmlns:w="http://schemas.openxmlformats.org/wordprocessingml/2006/main" xmlns:w14="http://schemas.microsoft.com/office/word/2010/wordml" xmlns:w15="http://schemas.microsoft.com/office/word/2012/wordml" xmlns:w16cex="http://schemas.microsoft.com/office/word/2018/wordml/cex" xmlns:w16cid="http://schemas.microsoft.com/office/word/2016/wordml/cid" xmlns:w16="http://schemas.microsoft.com/office/word/2018/wordml" xmlns:w16du="http://schemas.microsoft.com/office/word/2023/wordml/word16du" xmlns:w16sdtdh="http://schemas.microsoft.com/office/word/2020/wordml/sdtdatahash" xmlns:w16se="http://schemas.microsoft.com/office/word/2015/wordml/symex" xmlns:wpg="http://schemas.microsoft.com/office/word/2010/wordprocessingGroup" xmlns:wpi="http://schemas.microsoft.com/office/word/2010/wordprocessingInk" xmlns:wne="http://schemas.microsoft.com/office/word/2006/wordml" xmlns:wps="http://schemas.microsoft.com/office/word/2010/wordprocessingShape" mc:Ignorable="w14 w15 w16se w16cid w16 w16cex w16sdtdh wp14">
   <w:abstractNum w:abstractNumId="0" w15:restartNumberingAfterBreak="0">
     <w:nsid w:val="02966989"/>
     <w:multiLevelType w:val="hybridMultilevel"/>
@@ -9431,7 +10538,7 @@
 </file>
 
 <file path=word/people.xml><?xml version="1.0" encoding="utf-8"?>
-<w15:people xmlns:wpc="http://schemas.microsoft.com/office/word/2010/wordprocessingCanvas" xmlns:cx="http://schemas.microsoft.com/office/drawing/2014/chartex" xmlns:cx1="http://schemas.microsoft.com/office/drawing/2015/9/8/chartex" xmlns:cx2="http://schemas.microsoft.com/office/drawing/2015/10/21/chartex" xmlns:cx3="http://schemas.microsoft.com/office/drawing/2016/5/9/chartex" xmlns:cx4="http://schemas.microsoft.com/office/drawing/2016/5/10/chartex" xmlns:cx5="http://schemas.microsoft.com/office/drawing/2016/5/11/chartex" xmlns:cx6="http://schemas.microsoft.com/office/drawing/2016/5/12/chartex" xmlns:cx7="http://schemas.microsoft.com/office/drawing/2016/5/13/chartex" xmlns:cx8="http://schemas.microsoft.com/office/drawing/2016/5/14/chartex" xmlns:mc="http://schemas.openxmlformats.org/markup-compatibility/2006" xmlns:aink="http://schemas.microsoft.com/office/drawing/2016/ink" xmlns:am3d="http://schemas.microsoft.com/office/drawing/2017/model3d" xmlns:o="urn:schemas-microsoft-com:office:office" xmlns:oel="http://schemas.microsoft.com/office/2019/extlst" xmlns:r="http://schemas.openxmlformats.org/officeDocument/2006/relationships" xmlns:m="http://schemas.openxmlformats.org/officeDocument/2006/math" xmlns:v="urn:schemas-microsoft-com:vml" xmlns:wp14="http://schemas.microsoft.com/office/word/2010/wordprocessingDrawing" xmlns:wp="http://schemas.openxmlformats.org/drawingml/2006/wordprocessingDrawing" xmlns:w10="urn:schemas-microsoft-com:office:word" xmlns:w="http://schemas.openxmlformats.org/wordprocessingml/2006/main" xmlns:w14="http://schemas.microsoft.com/office/word/2010/wordml" xmlns:w15="http://schemas.microsoft.com/office/word/2012/wordml" xmlns:w16cex="http://schemas.microsoft.com/office/word/2018/wordml/cex" xmlns:w16cid="http://schemas.microsoft.com/office/word/2016/wordml/cid" xmlns:w16="http://schemas.microsoft.com/office/word/2018/wordml" xmlns:w16sdtdh="http://schemas.microsoft.com/office/word/2020/wordml/sdtdatahash" xmlns:w16se="http://schemas.microsoft.com/office/word/2015/wordml/symex" xmlns:wpg="http://schemas.microsoft.com/office/word/2010/wordprocessingGroup" xmlns:wpi="http://schemas.microsoft.com/office/word/2010/wordprocessingInk" xmlns:wne="http://schemas.microsoft.com/office/word/2006/wordml" xmlns:wps="http://schemas.microsoft.com/office/word/2010/wordprocessingShape" mc:Ignorable="w14 w15 w16se w16cid w16 w16cex w16sdtdh wp14">
+<w15:people xmlns:wpc="http://schemas.microsoft.com/office/word/2010/wordprocessingCanvas" xmlns:cx="http://schemas.microsoft.com/office/drawing/2014/chartex" xmlns:cx1="http://schemas.microsoft.com/office/drawing/2015/9/8/chartex" xmlns:cx2="http://schemas.microsoft.com/office/drawing/2015/10/21/chartex" xmlns:cx3="http://schemas.microsoft.com/office/drawing/2016/5/9/chartex" xmlns:cx4="http://schemas.microsoft.com/office/drawing/2016/5/10/chartex" xmlns:cx5="http://schemas.microsoft.com/office/drawing/2016/5/11/chartex" xmlns:cx6="http://schemas.microsoft.com/office/drawing/2016/5/12/chartex" xmlns:cx7="http://schemas.microsoft.com/office/drawing/2016/5/13/chartex" xmlns:cx8="http://schemas.microsoft.com/office/drawing/2016/5/14/chartex" xmlns:mc="http://schemas.openxmlformats.org/markup-compatibility/2006" xmlns:aink="http://schemas.microsoft.com/office/drawing/2016/ink" xmlns:am3d="http://schemas.microsoft.com/office/drawing/2017/model3d" xmlns:o="urn:schemas-microsoft-com:office:office" xmlns:oel="http://schemas.microsoft.com/office/2019/extlst" xmlns:r="http://schemas.openxmlformats.org/officeDocument/2006/relationships" xmlns:m="http://schemas.openxmlformats.org/officeDocument/2006/math" xmlns:v="urn:schemas-microsoft-com:vml" xmlns:wp14="http://schemas.microsoft.com/office/word/2010/wordprocessingDrawing" xmlns:wp="http://schemas.openxmlformats.org/drawingml/2006/wordprocessingDrawing" xmlns:w10="urn:schemas-microsoft-com:office:word" xmlns:w="http://schemas.openxmlformats.org/wordprocessingml/2006/main" xmlns:w14="http://schemas.microsoft.com/office/word/2010/wordml" xmlns:w15="http://schemas.microsoft.com/office/word/2012/wordml" xmlns:w16cex="http://schemas.microsoft.com/office/word/2018/wordml/cex" xmlns:w16cid="http://schemas.microsoft.com/office/word/2016/wordml/cid" xmlns:w16="http://schemas.microsoft.com/office/word/2018/wordml" xmlns:w16du="http://schemas.microsoft.com/office/word/2023/wordml/word16du" xmlns:w16sdtdh="http://schemas.microsoft.com/office/word/2020/wordml/sdtdatahash" xmlns:w16se="http://schemas.microsoft.com/office/word/2015/wordml/symex" xmlns:wpg="http://schemas.microsoft.com/office/word/2010/wordprocessingGroup" xmlns:wpi="http://schemas.microsoft.com/office/word/2010/wordprocessingInk" xmlns:wne="http://schemas.microsoft.com/office/word/2006/wordml" xmlns:wps="http://schemas.microsoft.com/office/word/2010/wordprocessingShape" mc:Ignorable="w14 w15 w16se w16cid w16 w16cex w16sdtdh wp14">
   <w15:person w15:author="Ritesh Shrestha">
     <w15:presenceInfo w15:providerId="AD" w15:userId="S::ritesh.shrestha@stud.tu-darmstadt.de::f3c7e211-ec11-483a-8661-9e639ca40bb9"/>
   </w15:person>

</xml_diff>